<commit_message>
Branch Idea Wizard's logical framework by KA action: mobilities for KA210, WPs for others
KA210 (Small-scale Partnerships) doesn't use a formal Work Package
structure in the Programme Guide, unlike KA220/KA240 — it's implemented
through mobilities/activities instead. The "Mantıksal Çerçeve" step now
detects KA210 (from the problem-cozum step's KA action label) and asks
for a table of complementary mobilities that feed into each other
(each one's concrete output becomes the next one's input) rather than
work packages. Added an explicit continuity check to Task 2's uyum
değerlendirmesi, tightened the hedefler step to require each specific
objective map cleanly to the target group and a later concrete
activity, and reinforced end-to-end coherence (general goal, specific
objectives, target group, concrete outputs, mobilities/WPs) in the
final concept note prompt. Verified both branches with a real
generation call and a dry-run check.

Co-Authored-By: Claude Sonnet 5 <noreply@anthropic.com>
</commit_message>
<xml_diff>
--- a/public/NEW !2024 AI supported IDEA DEVELOPMENT TEMPLATE.docx
+++ b/public/NEW !2024 AI supported IDEA DEVELOPMENT TEMPLATE.docx
@@ -78,13 +78,27 @@
       <w:r>
         <w:t xml:space="preserve">Getting started with ChatGPT: </w:t>
       </w:r>
-      <w:hyperlink r:id="rId7">
+      <w:hyperlink r:id="rId8">
         <w:r>
           <w:rPr>
             <w:color w:val="1155CC"/>
             <w:u w:val="single"/>
           </w:rPr>
-          <w:t>https://youtu.be/JG7YWp85Q-I</w:t>
+          <w:t>https://youtu.b</w:t>
+        </w:r>
+        <w:r>
+          <w:rPr>
+            <w:color w:val="1155CC"/>
+            <w:u w:val="single"/>
+          </w:rPr>
+          <w:t>e</w:t>
+        </w:r>
+        <w:r>
+          <w:rPr>
+            <w:color w:val="1155CC"/>
+            <w:u w:val="single"/>
+          </w:rPr>
+          <w:t>/JG7YWp85Q-I</w:t>
         </w:r>
       </w:hyperlink>
       <w:r>
@@ -102,7 +116,7 @@
       <w:r>
         <w:t xml:space="preserve">Using the Idea Development Template: </w:t>
       </w:r>
-      <w:hyperlink r:id="rId8">
+      <w:hyperlink r:id="rId9">
         <w:r>
           <w:rPr>
             <w:color w:val="1155CC"/>
@@ -141,7 +155,7 @@
       <w:r>
         <w:t xml:space="preserve">More on </w:t>
       </w:r>
-      <w:hyperlink r:id="rId9">
+      <w:hyperlink r:id="rId10">
         <w:r>
           <w:rPr>
             <w:color w:val="1155CC"/>
@@ -156,7 +170,7 @@
         <w:jc w:val="left"/>
       </w:pPr>
       <w:r>
-        <w:pict w14:anchorId="596CD75D">
+        <w:pict w14:anchorId="51BC2AF5">
           <v:rect id="_x0000_i1025" style="width:0;height:1.5pt" o:hralign="center" o:hrstd="t" o:hr="t" fillcolor="#a0a0a0" stroked="f"/>
         </w:pict>
       </w:r>
@@ -311,7 +325,7 @@
     </w:p>
     <w:tbl>
       <w:tblPr>
-        <w:tblStyle w:val="52"/>
+        <w:tblStyle w:val="a"/>
         <w:tblW w:w="9360" w:type="dxa"/>
         <w:tblInd w:w="0" w:type="dxa"/>
         <w:tblBorders>
@@ -411,7 +425,7 @@
     </w:p>
     <w:tbl>
       <w:tblPr>
-        <w:tblStyle w:val="51"/>
+        <w:tblStyle w:val="a0"/>
         <w:tblW w:w="9360" w:type="dxa"/>
         <w:tblInd w:w="0" w:type="dxa"/>
         <w:tblBorders>
@@ -471,7 +485,7 @@
     <w:p/>
     <w:tbl>
       <w:tblPr>
-        <w:tblStyle w:val="50"/>
+        <w:tblStyle w:val="a1"/>
         <w:tblW w:w="9360" w:type="dxa"/>
         <w:tblInd w:w="0" w:type="dxa"/>
         <w:tblBorders>
@@ -533,7 +547,7 @@
     </w:p>
     <w:tbl>
       <w:tblPr>
-        <w:tblStyle w:val="49"/>
+        <w:tblStyle w:val="a2"/>
         <w:tblW w:w="9360" w:type="dxa"/>
         <w:tblInd w:w="0" w:type="dxa"/>
         <w:tblBorders>
@@ -804,7 +818,7 @@
     <w:p/>
     <w:tbl>
       <w:tblPr>
-        <w:tblStyle w:val="48"/>
+        <w:tblStyle w:val="a3"/>
         <w:tblW w:w="9360" w:type="dxa"/>
         <w:tblInd w:w="0" w:type="dxa"/>
         <w:tblBorders>
@@ -859,7 +873,7 @@
     <w:p/>
     <w:tbl>
       <w:tblPr>
-        <w:tblStyle w:val="47"/>
+        <w:tblStyle w:val="a4"/>
         <w:tblW w:w="9360" w:type="dxa"/>
         <w:tblInd w:w="0" w:type="dxa"/>
         <w:tblBorders>
@@ -912,11 +926,84 @@
               <w:rPr>
                 <w:highlight w:val="yellow"/>
               </w:rPr>
-              <w:t xml:space="preserve">Erasmus+ </w:t>
-            </w:r>
-            <w:r>
-              <w:t xml:space="preserve"> KA220 SCH </w:t>
-            </w:r>
+              <w:t>Erasmus+ Sp</w:t>
+            </w:r>
+            <w:r>
+              <w:rPr>
+                <w:highlight w:val="yellow"/>
+              </w:rPr>
+              <w:t>ort, KA210 (</w:t>
+            </w:r>
+            <w:proofErr w:type="gramStart"/>
+            <w:r>
+              <w:rPr>
+                <w:highlight w:val="yellow"/>
+              </w:rPr>
+              <w:t>SCH,ADU</w:t>
+            </w:r>
+            <w:proofErr w:type="gramEnd"/>
+            <w:r>
+              <w:rPr>
+                <w:highlight w:val="yellow"/>
+              </w:rPr>
+              <w:t>,</w:t>
+            </w:r>
+            <w:proofErr w:type="gramStart"/>
+            <w:r>
+              <w:rPr>
+                <w:highlight w:val="yellow"/>
+              </w:rPr>
+              <w:t>YOU,VET</w:t>
+            </w:r>
+            <w:proofErr w:type="gramEnd"/>
+            <w:r>
+              <w:rPr>
+                <w:highlight w:val="yellow"/>
+              </w:rPr>
+              <w:t>), KA220(</w:t>
+            </w:r>
+            <w:proofErr w:type="gramStart"/>
+            <w:r>
+              <w:rPr>
+                <w:highlight w:val="yellow"/>
+              </w:rPr>
+              <w:t>SCH,YOU</w:t>
+            </w:r>
+            <w:proofErr w:type="gramEnd"/>
+            <w:r>
+              <w:rPr>
+                <w:highlight w:val="yellow"/>
+              </w:rPr>
+              <w:t>,</w:t>
+            </w:r>
+            <w:proofErr w:type="gramStart"/>
+            <w:r>
+              <w:rPr>
+                <w:highlight w:val="yellow"/>
+              </w:rPr>
+              <w:t>ADU,VET</w:t>
+            </w:r>
+            <w:proofErr w:type="gramEnd"/>
+            <w:r>
+              <w:rPr>
+                <w:highlight w:val="yellow"/>
+              </w:rPr>
+              <w:t>,</w:t>
+            </w:r>
+            <w:proofErr w:type="gramStart"/>
+            <w:r>
+              <w:rPr>
+                <w:highlight w:val="yellow"/>
+              </w:rPr>
+              <w:t>HED)</w:t>
+            </w:r>
+            <w:r>
+              <w:t xml:space="preserve">  </w:t>
+            </w:r>
+            <w:r>
+              <w:t xml:space="preserve"> </w:t>
+            </w:r>
+            <w:proofErr w:type="gramEnd"/>
             <w:r>
               <w:t xml:space="preserve">project. </w:t>
             </w:r>
@@ -969,19 +1056,7 @@
               <w:rPr>
                 <w:highlight w:val="yellow"/>
               </w:rPr>
-              <w:t xml:space="preserve">Avrupa'da 11 yaşından itibaren başlayan kariyer rehberliği süreçleri, eğitim kademeleri arasında kopukluk göstermekte, ortaokul-lise-üniversite ve iş hayatı geçişlerinde sistematik destek bulunmamakta, bu durum gençlerin meslek seçimi kararlarını bilinçsiz </w:t>
-            </w:r>
-            <w:r>
-              <w:rPr>
-                <w:highlight w:val="yellow"/>
-              </w:rPr>
-              <w:t xml:space="preserve">şekilde </w:t>
-            </w:r>
-            <w:r>
-              <w:rPr>
-                <w:highlight w:val="yellow"/>
-              </w:rPr>
-              <w:t>vermelerine yol açarken, özellikle kız çocuklarının toplumsal cinsiyet kalıpları nedeniyle STEM alanları gibi çeşitli kariyer seçeneklerini erken yaşta elemeye başlaması ve mevcut dijital araçların yaş gruplarının gelişimsel ihtiyaçlarına uygun olmaması, potansiyellerin tam olarak keşfedilememesine neden olmaktadır.</w:t>
+              <w:t>[your problem].</w:t>
             </w:r>
           </w:p>
         </w:tc>
@@ -1006,7 +1081,6 @@
               <w:jc w:val="left"/>
             </w:pPr>
             <w:r>
-              <w:lastRenderedPageBreak/>
               <w:t>Solution:</w:t>
             </w:r>
           </w:p>
@@ -1033,13 +1107,7 @@
               <w:rPr>
                 <w:highlight w:val="yellow"/>
               </w:rPr>
-              <w:t xml:space="preserve"> </w:t>
-            </w:r>
-            <w:r>
-              <w:rPr>
-                <w:highlight w:val="yellow"/>
-              </w:rPr>
-              <w:t>11 yaşından itibaren başlayan ve yetişkinliğe kadar uzanan kesintisiz kariyer rehberliği modelini AI destekli kişiselleştirilmiş dijital platform ile sunarak, her yaş grubuna (11-14, 15-18) özel meslek edindirme ve kariyer geliştirme müfredatları oluşturup, özellikle kız çocuklarının cinsiyet kalıplarından kurtulmasını destekleyen cinsiyet duyarlı pedagoji uygulayarak, belediye-okul-üniversite işbirliğinde 200+ eğiticiyi kapasitelendirip, ortaokul-lise-üniversite ve iş hayatı arasındaki tüm geçişlerde sürekli destek sağlayacak ve 4 Avrupa ülkesindeki 1.200+ katılımcılı pilot uygulamalarla kanıtlanmış, ölçeklenebilir ve sürdürülebilir bir ekosistem yaratacaktır.</w:t>
+              <w:t xml:space="preserve"> [your solution] </w:t>
             </w:r>
           </w:p>
         </w:tc>
@@ -1105,7 +1173,7 @@
     <w:p/>
     <w:tbl>
       <w:tblPr>
-        <w:tblStyle w:val="46"/>
+        <w:tblStyle w:val="a5"/>
         <w:tblW w:w="9360" w:type="dxa"/>
         <w:tblInd w:w="0" w:type="dxa"/>
         <w:tblBorders>
@@ -1160,7 +1228,7 @@
     <w:p/>
     <w:tbl>
       <w:tblPr>
-        <w:tblStyle w:val="45"/>
+        <w:tblStyle w:val="a6"/>
         <w:tblW w:w="9360" w:type="dxa"/>
         <w:tblInd w:w="0" w:type="dxa"/>
         <w:tblBorders>
@@ -1410,7 +1478,7 @@
     </w:p>
     <w:tbl>
       <w:tblPr>
-        <w:tblStyle w:val="44"/>
+        <w:tblStyle w:val="a7"/>
         <w:tblW w:w="9360" w:type="dxa"/>
         <w:tblInd w:w="0" w:type="dxa"/>
         <w:tblBorders>
@@ -1457,7 +1525,7 @@
     <w:p/>
     <w:tbl>
       <w:tblPr>
-        <w:tblStyle w:val="43"/>
+        <w:tblStyle w:val="a8"/>
         <w:tblW w:w="9360" w:type="dxa"/>
         <w:tblInd w:w="0" w:type="dxa"/>
         <w:tblBorders>
@@ -1512,7 +1580,7 @@
     <w:p/>
     <w:tbl>
       <w:tblPr>
-        <w:tblStyle w:val="42"/>
+        <w:tblStyle w:val="a9"/>
         <w:tblW w:w="9360" w:type="dxa"/>
         <w:tblInd w:w="0" w:type="dxa"/>
         <w:tblBorders>
@@ -1704,7 +1772,7 @@
     </w:p>
     <w:tbl>
       <w:tblPr>
-        <w:tblStyle w:val="41"/>
+        <w:tblStyle w:val="aa"/>
         <w:tblW w:w="9360" w:type="dxa"/>
         <w:tblInd w:w="0" w:type="dxa"/>
         <w:tblBorders>
@@ -1808,7 +1876,7 @@
     </w:p>
     <w:tbl>
       <w:tblPr>
-        <w:tblStyle w:val="40"/>
+        <w:tblStyle w:val="ab"/>
         <w:tblW w:w="9360" w:type="dxa"/>
         <w:tblInd w:w="0" w:type="dxa"/>
         <w:tblBorders>
@@ -1893,35 +1961,65 @@
               <w:rPr>
                 <w:b/>
               </w:rPr>
-              <w:t xml:space="preserve">The final recipients of knowledge will be -  </w:t>
+              <w:t xml:space="preserve">The final recipients of knowledge will be </w:t>
+            </w:r>
+            <w:proofErr w:type="gramStart"/>
+            <w:r>
+              <w:rPr>
+                <w:b/>
+              </w:rPr>
+              <w:t xml:space="preserve">-  </w:t>
             </w:r>
             <w:r>
               <w:rPr>
                 <w:b/>
                 <w:highlight w:val="yellow"/>
               </w:rPr>
-              <w:t>your final recipient</w:t>
-            </w:r>
-          </w:p>
-          <w:p>
-            <w:pPr>
+              <w:t>your</w:t>
+            </w:r>
+            <w:proofErr w:type="gramEnd"/>
+            <w:r>
               <w:rPr>
                 <w:b/>
                 <w:highlight w:val="yellow"/>
               </w:rPr>
-            </w:pPr>
-            <w:r>
-              <w:rPr>
-                <w:b/>
-              </w:rPr>
-              <w:t xml:space="preserve">Results will be developed for -  </w:t>
-            </w:r>
-            <w:r>
+              <w:t xml:space="preserve"> final recipient</w:t>
+            </w:r>
+          </w:p>
+          <w:p>
+            <w:pPr>
               <w:rPr>
                 <w:b/>
                 <w:highlight w:val="yellow"/>
               </w:rPr>
-              <w:t>results will be developed for</w:t>
+            </w:pPr>
+            <w:r>
+              <w:rPr>
+                <w:b/>
+              </w:rPr>
+              <w:t xml:space="preserve">Results will be developed for </w:t>
+            </w:r>
+            <w:proofErr w:type="gramStart"/>
+            <w:r>
+              <w:rPr>
+                <w:b/>
+              </w:rPr>
+              <w:t xml:space="preserve">-  </w:t>
+            </w:r>
+            <w:r>
+              <w:rPr>
+                <w:b/>
+                <w:highlight w:val="yellow"/>
+              </w:rPr>
+              <w:t>results</w:t>
+            </w:r>
+            <w:proofErr w:type="gramEnd"/>
+            <w:r>
+              <w:rPr>
+                <w:b/>
+                <w:highlight w:val="yellow"/>
+              </w:rPr>
+              <w:t xml:space="preserve"> will be developed for</w:t>
             </w:r>
           </w:p>
         </w:tc>
@@ -1937,7 +2035,7 @@
     <w:p/>
     <w:tbl>
       <w:tblPr>
-        <w:tblStyle w:val="39"/>
+        <w:tblStyle w:val="ac"/>
         <w:tblW w:w="9360" w:type="dxa"/>
         <w:tblInd w:w="0" w:type="dxa"/>
         <w:tblBorders>
@@ -1998,7 +2096,7 @@
     </w:p>
     <w:tbl>
       <w:tblPr>
-        <w:tblStyle w:val="38"/>
+        <w:tblStyle w:val="ad"/>
         <w:tblW w:w="9360" w:type="dxa"/>
         <w:tblInd w:w="0" w:type="dxa"/>
         <w:tblBorders>
@@ -2068,7 +2166,7 @@
     <w:p/>
     <w:tbl>
       <w:tblPr>
-        <w:tblStyle w:val="37"/>
+        <w:tblStyle w:val="ae"/>
         <w:tblW w:w="9360" w:type="dxa"/>
         <w:tblInd w:w="0" w:type="dxa"/>
         <w:tblBorders>
@@ -2153,7 +2251,21 @@
         <w:rPr>
           <w:b/>
         </w:rPr>
-        <w:t>Why Starting Over Can Be a Game-Changer:</w:t>
+        <w:t xml:space="preserve">Why Starting Over Can Be a </w:t>
+      </w:r>
+      <w:proofErr w:type="gramStart"/>
+      <w:r>
+        <w:rPr>
+          <w:b/>
+        </w:rPr>
+        <w:t>Game-Changer</w:t>
+      </w:r>
+      <w:proofErr w:type="gramEnd"/>
+      <w:r>
+        <w:rPr>
+          <w:b/>
+        </w:rPr>
+        <w:t>:</w:t>
       </w:r>
     </w:p>
     <w:p>
@@ -2223,7 +2335,7 @@
     <w:p/>
     <w:tbl>
       <w:tblPr>
-        <w:tblStyle w:val="36"/>
+        <w:tblStyle w:val="af"/>
         <w:tblW w:w="9360" w:type="dxa"/>
         <w:tblInd w:w="0" w:type="dxa"/>
         <w:tblBorders>
@@ -2284,7 +2396,7 @@
     </w:p>
     <w:tbl>
       <w:tblPr>
-        <w:tblStyle w:val="35"/>
+        <w:tblStyle w:val="af0"/>
         <w:tblW w:w="9360" w:type="dxa"/>
         <w:tblInd w:w="0" w:type="dxa"/>
         <w:tblBorders>
@@ -2365,6 +2477,7 @@
                 <w:highlight w:val="yellow"/>
               </w:rPr>
             </w:pPr>
+            <w:proofErr w:type="gramStart"/>
             <w:r>
               <w:t>Solution:</w:t>
             </w:r>
@@ -2372,7 +2485,28 @@
               <w:rPr>
                 <w:highlight w:val="yellow"/>
               </w:rPr>
-              <w:t>[your dolution]</w:t>
+              <w:t>[</w:t>
+            </w:r>
+            <w:proofErr w:type="gramEnd"/>
+            <w:r>
+              <w:rPr>
+                <w:highlight w:val="yellow"/>
+              </w:rPr>
+              <w:t xml:space="preserve">your </w:t>
+            </w:r>
+            <w:proofErr w:type="spellStart"/>
+            <w:r>
+              <w:rPr>
+                <w:highlight w:val="yellow"/>
+              </w:rPr>
+              <w:t>dolution</w:t>
+            </w:r>
+            <w:proofErr w:type="spellEnd"/>
+            <w:r>
+              <w:rPr>
+                <w:highlight w:val="yellow"/>
+              </w:rPr>
+              <w:t>]</w:t>
             </w:r>
           </w:p>
           <w:p>
@@ -2470,7 +2604,7 @@
     <w:p/>
     <w:tbl>
       <w:tblPr>
-        <w:tblStyle w:val="34"/>
+        <w:tblStyle w:val="af1"/>
         <w:tblW w:w="9360" w:type="dxa"/>
         <w:tblInd w:w="0" w:type="dxa"/>
         <w:tblBorders>
@@ -2530,7 +2664,7 @@
     <w:p/>
     <w:tbl>
       <w:tblPr>
-        <w:tblStyle w:val="33"/>
+        <w:tblStyle w:val="af2"/>
         <w:tblW w:w="9360" w:type="dxa"/>
         <w:tblInd w:w="0" w:type="dxa"/>
         <w:tblBorders>
@@ -2575,8 +2709,13 @@
             </w:pPr>
             <w:bookmarkStart w:id="7" w:name="_j0v6l8xrzp5l" w:colFirst="0" w:colLast="0"/>
             <w:bookmarkEnd w:id="7"/>
-            <w:r>
-              <w:t>A number of already developed projects in your niche.</w:t>
+            <w:proofErr w:type="gramStart"/>
+            <w:r>
+              <w:t>A number of</w:t>
+            </w:r>
+            <w:proofErr w:type="gramEnd"/>
+            <w:r>
+              <w:t xml:space="preserve"> already developed projects in your niche.</w:t>
             </w:r>
           </w:p>
         </w:tc>
@@ -2591,7 +2730,7 @@
     </w:p>
     <w:tbl>
       <w:tblPr>
-        <w:tblStyle w:val="32"/>
+        <w:tblStyle w:val="af3"/>
         <w:tblW w:w="9360" w:type="dxa"/>
         <w:tblInd w:w="0" w:type="dxa"/>
         <w:tblBorders>
@@ -2629,7 +2768,7 @@
             <w:r>
               <w:t xml:space="preserve">Navigate to </w:t>
             </w:r>
-            <w:hyperlink r:id="rId10">
+            <w:hyperlink r:id="rId11">
               <w:r>
                 <w:rPr>
                   <w:color w:val="1155CC"/>
@@ -2763,7 +2902,15 @@
     </w:p>
     <w:p>
       <w:r>
-        <w:t>Congratulations on developing a unique project idea! With fewer than 5 similar projects in your research, you have successfully identified a distinct approach to addressing the problem. Continue on the next section.</w:t>
+        <w:t xml:space="preserve">Congratulations on developing a unique project idea! With fewer than 5 similar projects in your research, you have successfully identified a distinct approach to addressing the problem. </w:t>
+      </w:r>
+      <w:proofErr w:type="gramStart"/>
+      <w:r>
+        <w:t>Continue on</w:t>
+      </w:r>
+      <w:proofErr w:type="gramEnd"/>
+      <w:r>
+        <w:t xml:space="preserve"> the next section.</w:t>
       </w:r>
     </w:p>
     <w:p/>
@@ -2854,7 +3001,7 @@
     <w:p/>
     <w:tbl>
       <w:tblPr>
-        <w:tblStyle w:val="31"/>
+        <w:tblStyle w:val="af4"/>
         <w:tblW w:w="9360" w:type="dxa"/>
         <w:tblInd w:w="0" w:type="dxa"/>
         <w:tblBorders>
@@ -2924,7 +3071,7 @@
     </w:p>
     <w:tbl>
       <w:tblPr>
-        <w:tblStyle w:val="30"/>
+        <w:tblStyle w:val="af5"/>
         <w:tblW w:w="9405" w:type="dxa"/>
         <w:tblInd w:w="-45" w:type="dxa"/>
         <w:tblBorders>
@@ -2972,7 +3119,23 @@
                 <w:b/>
                 <w:color w:val="0E101A"/>
               </w:rPr>
-              <w:t>Based on the proposed project idea, which sector do you recommend to be this project submitted to (</w:t>
+              <w:t xml:space="preserve">Based on the proposed project idea, which sector do you recommend </w:t>
+            </w:r>
+            <w:proofErr w:type="gramStart"/>
+            <w:r>
+              <w:rPr>
+                <w:b/>
+                <w:color w:val="0E101A"/>
+              </w:rPr>
+              <w:t>to be</w:t>
+            </w:r>
+            <w:proofErr w:type="gramEnd"/>
+            <w:r>
+              <w:rPr>
+                <w:b/>
+                <w:color w:val="0E101A"/>
+              </w:rPr>
+              <w:t xml:space="preserve"> this project submitted to (</w:t>
             </w:r>
             <w:r>
               <w:rPr>
@@ -3057,7 +3220,7 @@
     </w:p>
     <w:tbl>
       <w:tblPr>
-        <w:tblStyle w:val="29"/>
+        <w:tblStyle w:val="af6"/>
         <w:tblW w:w="9360" w:type="dxa"/>
         <w:tblInd w:w="0" w:type="dxa"/>
         <w:tblBorders>
@@ -3480,7 +3643,21 @@
               <w:rPr>
                 <w:color w:val="0E101A"/>
               </w:rPr>
-              <w:t>Improving the competencies of educators and other adults education staff</w:t>
+              <w:t xml:space="preserve">Improving the competencies of educators and other </w:t>
+            </w:r>
+            <w:proofErr w:type="gramStart"/>
+            <w:r>
+              <w:rPr>
+                <w:color w:val="0E101A"/>
+              </w:rPr>
+              <w:t>adults</w:t>
+            </w:r>
+            <w:proofErr w:type="gramEnd"/>
+            <w:r>
+              <w:rPr>
+                <w:color w:val="0E101A"/>
+              </w:rPr>
+              <w:t xml:space="preserve"> education staff</w:t>
             </w:r>
           </w:p>
           <w:p>
@@ -4025,7 +4202,7 @@
     <w:p/>
     <w:tbl>
       <w:tblPr>
-        <w:tblStyle w:val="28"/>
+        <w:tblStyle w:val="af7"/>
         <w:tblW w:w="9360" w:type="dxa"/>
         <w:tblInd w:w="0" w:type="dxa"/>
         <w:tblBorders>
@@ -4089,7 +4266,7 @@
           <w:noProof/>
         </w:rPr>
         <w:drawing>
-          <wp:inline distT="114300" distB="114300" distL="114300" distR="114300" wp14:anchorId="3F8EF81B" wp14:editId="6AD0FE2B">
+          <wp:inline distT="114300" distB="114300" distL="114300" distR="114300" wp14:anchorId="1672DC30" wp14:editId="4F75E7B1">
             <wp:extent cx="5943600" cy="3263900"/>
             <wp:effectExtent l="0" t="0" r="0" b="0"/>
             <wp:docPr id="3" name="image2.png"/>
@@ -4102,7 +4279,7 @@
                     <pic:cNvPicPr preferRelativeResize="0"/>
                   </pic:nvPicPr>
                   <pic:blipFill>
-                    <a:blip r:embed="rId11"/>
+                    <a:blip r:embed="rId12"/>
                     <a:srcRect/>
                     <a:stretch>
                       <a:fillRect/>
@@ -4127,7 +4304,7 @@
     </w:p>
     <w:tbl>
       <w:tblPr>
-        <w:tblStyle w:val="27"/>
+        <w:tblStyle w:val="af8"/>
         <w:tblW w:w="9360" w:type="dxa"/>
         <w:tblInd w:w="0" w:type="dxa"/>
         <w:tblBorders>
@@ -4287,6 +4464,11 @@
           </w:tcPr>
           <w:p/>
           <w:p>
+            <w:pPr>
+              <w:rPr>
+                <w:highlight w:val="yellow"/>
+              </w:rPr>
+            </w:pPr>
             <w:r>
               <w:t>Our general goal</w:t>
             </w:r>
@@ -4294,52 +4476,25 @@
               <w:rPr>
                 <w:highlight w:val="yellow"/>
               </w:rPr>
-              <w:t xml:space="preserve"> </w:t>
+              <w:t xml:space="preserve"> [is improved self-leadership for primary school children],</w:t>
+            </w:r>
+          </w:p>
+          <w:p>
+            <w:r>
+              <w:t xml:space="preserve">suggest a few specific goals needed to develop and implement this project, which will be ready indicators. </w:t>
+            </w:r>
+          </w:p>
+          <w:p/>
+          <w:p>
+            <w:r>
+              <w:lastRenderedPageBreak/>
+              <w:t>The project is meant for [</w:t>
             </w:r>
             <w:r>
               <w:rPr>
                 <w:highlight w:val="yellow"/>
               </w:rPr>
-              <w:t>“</w:t>
-            </w:r>
-            <w:r>
-              <w:rPr>
-                <w:highlight w:val="yellow"/>
-              </w:rPr>
-              <w:t>11 yaşından itibaren başlayan ve yetişkinliğe kadar uzanan kesintisiz kariyer rehberliği modelini AI destekli kişiselleştirilmiş dijital platform ile sunarak, her yaş grubuna (11-14, 15-18) özel meslek edindirme ve kariyer geliştirme müfredatları oluşturup, özellikle kız çocuklarının cinsiyet kalıplarından kurtulmasını destekleyen cinsiyet duyarlı pedagoji uygula</w:t>
-            </w:r>
-            <w:r>
-              <w:t>mak”</w:t>
-            </w:r>
-          </w:p>
-          <w:p>
-            <w:r>
-              <w:lastRenderedPageBreak/>
-              <w:t xml:space="preserve">suggest a few specific goals needed to develop and implement this project, which will be ready indicators. </w:t>
-            </w:r>
-          </w:p>
-          <w:p/>
-          <w:p>
-            <w:r>
-              <w:t>The project is meant for [</w:t>
-            </w:r>
-            <w:r>
-              <w:rPr>
-                <w:highlight w:val="yellow"/>
-              </w:rPr>
-              <w:t>11-14, 15-18</w:t>
-            </w:r>
-            <w:r>
-              <w:rPr>
-                <w:highlight w:val="yellow"/>
-              </w:rPr>
-              <w:t xml:space="preserve"> </w:t>
-            </w:r>
-            <w:r>
-              <w:rPr>
-                <w:highlight w:val="yellow"/>
-              </w:rPr>
-              <w:t>]</w:t>
+              <w:t>teachers who will teach students and for students]</w:t>
             </w:r>
             <w:r>
               <w:t>. At this moment, disregard SMART goals for better clarity in decision-making.</w:t>
@@ -4381,7 +4536,7 @@
     <w:p/>
     <w:tbl>
       <w:tblPr>
-        <w:tblStyle w:val="26"/>
+        <w:tblStyle w:val="af9"/>
         <w:tblW w:w="9360" w:type="dxa"/>
         <w:tblInd w:w="0" w:type="dxa"/>
         <w:tblBorders>
@@ -4442,7 +4597,7 @@
     </w:p>
     <w:tbl>
       <w:tblPr>
-        <w:tblStyle w:val="25"/>
+        <w:tblStyle w:val="afa"/>
         <w:tblW w:w="9360" w:type="dxa"/>
         <w:tblInd w:w="0" w:type="dxa"/>
         <w:tblBorders>
@@ -4511,97 +4666,7 @@
               <w:rPr>
                 <w:highlight w:val="yellow"/>
               </w:rPr>
-              <w:t>AI DESTEKLİ DİJİTAL PLATFORM GELİŞTİRME</w:t>
-            </w:r>
-          </w:p>
-          <w:p>
-            <w:pPr>
-              <w:rPr>
-                <w:highlight w:val="yellow"/>
-              </w:rPr>
-            </w:pPr>
-            <w:r>
-              <w:rPr>
-                <w:highlight w:val="yellow"/>
-              </w:rPr>
-              <w:t>YAŞ GRUBUNA ÖZEL MÜFREDATLAR</w:t>
-            </w:r>
-            <w:r>
-              <w:rPr>
-                <w:highlight w:val="yellow"/>
-              </w:rPr>
-              <w:t xml:space="preserve"> </w:t>
-            </w:r>
-            <w:r>
-              <w:rPr>
-                <w:highlight w:val="yellow"/>
-              </w:rPr>
-              <w:t>MESLEKİ GELİŞİM MÜFREDATLARı GELİŞTİRME</w:t>
-            </w:r>
-          </w:p>
-          <w:p>
-            <w:pPr>
-              <w:rPr>
-                <w:highlight w:val="yellow"/>
-              </w:rPr>
-            </w:pPr>
-            <w:r>
-              <w:rPr>
-                <w:highlight w:val="yellow"/>
-              </w:rPr>
-              <w:t>CİNSİYET DUYARLI PEDAGOJİ ENTEGRASYONU</w:t>
-            </w:r>
-          </w:p>
-          <w:p>
-            <w:pPr>
-              <w:rPr>
-                <w:highlight w:val="yellow"/>
-              </w:rPr>
-            </w:pPr>
-            <w:r>
-              <w:rPr>
-                <w:highlight w:val="yellow"/>
-              </w:rPr>
-              <w:t>EĞİTİCİ KAPASİTELENDİRME</w:t>
-            </w:r>
-          </w:p>
-          <w:p>
-            <w:pPr>
-              <w:rPr>
-                <w:highlight w:val="yellow"/>
-              </w:rPr>
-            </w:pPr>
-            <w:r>
-              <w:rPr>
-                <w:highlight w:val="yellow"/>
-              </w:rPr>
-              <w:t>UYGULAMA VE ETKİ DEĞERLENDİRMESİ</w:t>
-            </w:r>
-          </w:p>
-          <w:p>
-            <w:pPr>
-              <w:rPr>
-                <w:highlight w:val="yellow"/>
-              </w:rPr>
-            </w:pPr>
-            <w:r>
-              <w:rPr>
-                <w:highlight w:val="yellow"/>
-              </w:rPr>
-              <w:t>SÜRDÜRÜLEBİLİRLİK VE ÖLÇEKLENEBİLİRLİK</w:t>
-            </w:r>
-          </w:p>
-          <w:p>
-            <w:pPr>
-              <w:rPr>
-                <w:highlight w:val="yellow"/>
-              </w:rPr>
-            </w:pPr>
-            <w:r>
-              <w:rPr>
-                <w:highlight w:val="yellow"/>
-              </w:rPr>
-              <w:t>KURUMLAR ARASI İŞBİRLİĞİ MODELİ OLUŞTURMA</w:t>
+              <w:t>[name specific goals]</w:t>
             </w:r>
           </w:p>
           <w:p/>
@@ -4657,7 +4722,7 @@
     </w:p>
     <w:tbl>
       <w:tblPr>
-        <w:tblStyle w:val="24"/>
+        <w:tblStyle w:val="afb"/>
         <w:tblW w:w="9330" w:type="dxa"/>
         <w:tblInd w:w="0" w:type="dxa"/>
         <w:tblBorders>
@@ -5106,7 +5171,6 @@
           </w:tcPr>
           <w:p>
             <w:r>
-              <w:lastRenderedPageBreak/>
               <w:t>3</w:t>
             </w:r>
           </w:p>
@@ -5222,7 +5286,7 @@
     <w:p/>
     <w:tbl>
       <w:tblPr>
-        <w:tblStyle w:val="23"/>
+        <w:tblStyle w:val="afc"/>
         <w:tblW w:w="9360" w:type="dxa"/>
         <w:tblInd w:w="0" w:type="dxa"/>
         <w:tblBorders>
@@ -5290,7 +5354,7 @@
     </w:p>
     <w:tbl>
       <w:tblPr>
-        <w:tblStyle w:val="22"/>
+        <w:tblStyle w:val="afd"/>
         <w:tblW w:w="9360" w:type="dxa"/>
         <w:tblInd w:w="0" w:type="dxa"/>
         <w:tblBorders>
@@ -5404,7 +5468,7 @@
     <w:p/>
     <w:tbl>
       <w:tblPr>
-        <w:tblStyle w:val="21"/>
+        <w:tblStyle w:val="afe"/>
         <w:tblW w:w="9360" w:type="dxa"/>
         <w:tblInd w:w="0" w:type="dxa"/>
         <w:tblBorders>
@@ -5512,7 +5576,7 @@
     </w:p>
     <w:tbl>
       <w:tblPr>
-        <w:tblStyle w:val="20"/>
+        <w:tblStyle w:val="aff"/>
         <w:tblW w:w="9360" w:type="dxa"/>
         <w:tblInd w:w="0" w:type="dxa"/>
         <w:tblBorders>
@@ -5695,7 +5759,7 @@
     </w:p>
     <w:tbl>
       <w:tblPr>
-        <w:tblStyle w:val="19"/>
+        <w:tblStyle w:val="aff0"/>
         <w:tblpPr w:leftFromText="180" w:rightFromText="180" w:topFromText="180" w:bottomFromText="180" w:vertAnchor="text"/>
         <w:tblW w:w="9315" w:type="dxa"/>
         <w:tblInd w:w="0" w:type="dxa"/>
@@ -6019,7 +6083,7 @@
     <w:p/>
     <w:tbl>
       <w:tblPr>
-        <w:tblStyle w:val="18"/>
+        <w:tblStyle w:val="aff1"/>
         <w:tblW w:w="9360" w:type="dxa"/>
         <w:tblInd w:w="0" w:type="dxa"/>
         <w:tblBorders>
@@ -6087,7 +6151,7 @@
     </w:p>
     <w:tbl>
       <w:tblPr>
-        <w:tblStyle w:val="17"/>
+        <w:tblStyle w:val="aff2"/>
         <w:tblW w:w="9360" w:type="dxa"/>
         <w:tblInd w:w="0" w:type="dxa"/>
         <w:tblBorders>
@@ -6152,7 +6216,21 @@
               <w:rPr>
                 <w:b/>
               </w:rPr>
-              <w:t>The project’s vision is to ……(contribution) so that ….. (project’s impact).</w:t>
+              <w:t xml:space="preserve">The project’s vision is to ……(contribution) so that </w:t>
+            </w:r>
+            <w:proofErr w:type="gramStart"/>
+            <w:r>
+              <w:rPr>
+                <w:b/>
+              </w:rPr>
+              <w:t>…..</w:t>
+            </w:r>
+            <w:proofErr w:type="gramEnd"/>
+            <w:r>
+              <w:rPr>
+                <w:b/>
+              </w:rPr>
+              <w:t xml:space="preserve"> (project’s impact).</w:t>
             </w:r>
             <w:r>
               <w:br/>
@@ -6192,7 +6270,15 @@
               </w:numPr>
             </w:pPr>
             <w:r>
-              <w:t>Skills, Competencies or focus of the project. Example: "...[essential skills, e.g., process-thinking skills] to be better equipped to..."</w:t>
+              <w:t>Skills, Competencies or focus of the project. Example: "</w:t>
+            </w:r>
+            <w:proofErr w:type="gramStart"/>
+            <w:r>
+              <w:t>...[</w:t>
+            </w:r>
+            <w:proofErr w:type="gramEnd"/>
+            <w:r>
+              <w:t>essential skills, e.g., process-thinking skills] to be better equipped to..."</w:t>
             </w:r>
           </w:p>
           <w:p>
@@ -6236,7 +6322,15 @@
           </w:tcPr>
           <w:p>
             <w:r>
-              <w:t>The excellent project vision is similar to this:</w:t>
+              <w:t xml:space="preserve">The excellent project vision is </w:t>
+            </w:r>
+            <w:proofErr w:type="gramStart"/>
+            <w:r>
+              <w:t>similar to</w:t>
+            </w:r>
+            <w:proofErr w:type="gramEnd"/>
+            <w:r>
+              <w:t xml:space="preserve"> this:</w:t>
             </w:r>
           </w:p>
           <w:p>
@@ -6259,7 +6353,7 @@
     <w:p/>
     <w:tbl>
       <w:tblPr>
-        <w:tblStyle w:val="16"/>
+        <w:tblStyle w:val="aff3"/>
         <w:tblW w:w="9360" w:type="dxa"/>
         <w:tblInd w:w="0" w:type="dxa"/>
         <w:tblBorders>
@@ -6328,7 +6422,7 @@
     <w:p/>
     <w:tbl>
       <w:tblPr>
-        <w:tblStyle w:val="15"/>
+        <w:tblStyle w:val="aff4"/>
         <w:tblW w:w="9360" w:type="dxa"/>
         <w:tblInd w:w="0" w:type="dxa"/>
         <w:tblBorders>
@@ -6343,13 +6437,13 @@
         <w:tblLook w:val="0600" w:firstRow="0" w:lastRow="0" w:firstColumn="0" w:lastColumn="0" w:noHBand="1" w:noVBand="1"/>
       </w:tblPr>
       <w:tblGrid>
-        <w:gridCol w:w="7050"/>
-        <w:gridCol w:w="2310"/>
+        <w:gridCol w:w="6086"/>
+        <w:gridCol w:w="3274"/>
       </w:tblGrid>
       <w:tr>
         <w:tc>
           <w:tcPr>
-            <w:tcW w:w="7050" w:type="dxa"/>
+            <w:tcW w:w="6086" w:type="dxa"/>
             <w:tcBorders>
               <w:top w:val="single" w:sz="8" w:space="0" w:color="FFFFFF"/>
               <w:left w:val="single" w:sz="8" w:space="0" w:color="FFFFFF"/>
@@ -6379,7 +6473,7 @@
         </w:tc>
         <w:tc>
           <w:tcPr>
-            <w:tcW w:w="2310" w:type="dxa"/>
+            <w:tcW w:w="3274" w:type="dxa"/>
             <w:tcBorders>
               <w:top w:val="single" w:sz="8" w:space="0" w:color="FFFFFF"/>
               <w:left w:val="single" w:sz="8" w:space="0" w:color="FFFFFF"/>
@@ -6407,9 +6501,9 @@
               <mc:AlternateContent>
                 <mc:Choice Requires="wpg">
                   <w:drawing>
-                    <wp:inline distT="114300" distB="114300" distL="114300" distR="114300" wp14:anchorId="6EB3BA12" wp14:editId="7FF62784">
-                      <wp:extent cx="1108993" cy="830263"/>
-                      <wp:effectExtent l="0" t="0" r="0" b="0"/>
+                    <wp:inline distT="114300" distB="114300" distL="114300" distR="114300" wp14:anchorId="79464B5D" wp14:editId="59E313C4">
+                      <wp:extent cx="1460044" cy="906779"/>
+                      <wp:effectExtent l="0" t="0" r="26035" b="27305"/>
                       <wp:docPr id="1" name="Grup 1"/>
                       <wp:cNvGraphicFramePr/>
                       <a:graphic xmlns:a="http://schemas.openxmlformats.org/drawingml/2006/main">
@@ -6419,18 +6513,18 @@
                             <wpg:grpSpPr>
                               <a:xfrm>
                                 <a:off x="0" y="0"/>
-                                <a:ext cx="1108993" cy="830263"/>
-                                <a:chOff x="812225" y="274775"/>
-                                <a:chExt cx="1769550" cy="1324500"/>
+                                <a:ext cx="1460044" cy="906779"/>
+                                <a:chOff x="829159" y="-48662"/>
+                                <a:chExt cx="2329700" cy="1446563"/>
                               </a:xfrm>
                             </wpg:grpSpPr>
                             <wps:wsp>
-                              <wps:cNvPr id="779063112" name="Ok: Beşgen 779063112"/>
+                              <wps:cNvPr id="2021733436" name="Ok: Beşgen 2021733436"/>
                               <wps:cNvSpPr/>
                               <wps:spPr>
                                 <a:xfrm flipH="1">
-                                  <a:off x="817007" y="527395"/>
-                                  <a:ext cx="1486800" cy="1067100"/>
+                                  <a:off x="829159" y="186565"/>
+                                  <a:ext cx="2329700" cy="1211336"/>
                                 </a:xfrm>
                                 <a:prstGeom prst="homePlate">
                                   <a:avLst>
@@ -6489,12 +6583,12 @@
                               </wps:bodyPr>
                             </wps:wsp>
                             <wps:wsp>
-                              <wps:cNvPr id="34607497" name="Oval 34607497"/>
+                              <wps:cNvPr id="1485675434" name="Oval 1485675434"/>
                               <wps:cNvSpPr/>
                               <wps:spPr>
                                 <a:xfrm>
-                                  <a:off x="2048712" y="279550"/>
-                                  <a:ext cx="528300" cy="528300"/>
+                                  <a:off x="2133824" y="-48662"/>
+                                  <a:ext cx="528299" cy="528300"/>
                                 </a:xfrm>
                                 <a:prstGeom prst="ellipse">
                                   <a:avLst/>
@@ -6543,7 +6637,7 @@
                 </mc:Choice>
                 <mc:Fallback>
                   <w:pict>
-                    <v:group w14:anchorId="6EB3BA12" id="Grup 1" o:spid="_x0000_s1026" style="width:87.3pt;height:65.4pt;mso-position-horizontal-relative:char;mso-position-vertical-relative:line" coordorigin="8122,2747" coordsize="17695,13245" o:gfxdata="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">
+                    <v:group w14:anchorId="79464B5D" id="Grup 1" o:spid="_x0000_s1026" style="width:114.95pt;height:71.4pt;mso-position-horizontal-relative:char;mso-position-vertical-relative:line" coordorigin="8291,-486" coordsize="23297,14465" o:gfxdata="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">
                       <v:shapetype id="_x0000_t15" coordsize="21600,21600" o:spt="15" adj="16200" path="m@0,l,,,21600@0,21600,21600,10800xe">
                         <v:stroke joinstyle="miter"/>
                         <v:formulas>
@@ -6555,7 +6649,7 @@
                           <v:h position="#0,topLeft" xrange="0,21600"/>
                         </v:handles>
                       </v:shapetype>
-                      <v:shape id="Ok: Beşgen 779063112" o:spid="_x0000_s1027" type="#_x0000_t15" style="position:absolute;left:8170;top:5273;width:14868;height:10671;flip:x;visibility:visible;mso-wrap-style:square;v-text-anchor:middle" o:gfxdata="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" adj="18617" fillcolor="#cfe2f3" strokecolor="#595959">
+                      <v:shape id="Ok: Beşgen 2021733436" o:spid="_x0000_s1027" type="#_x0000_t15" style="position:absolute;left:8291;top:1865;width:23297;height:12114;flip:x;visibility:visible;mso-wrap-style:square;v-text-anchor:middle" o:gfxdata="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" adj="19439" fillcolor="#cfe2f3" strokecolor="#595959">
                         <v:stroke startarrowwidth="narrow" startarrowlength="short" endarrowwidth="narrow" endarrowlength="short" joinstyle="round"/>
                         <v:textbox inset="2.53958mm,2.53958mm,2.53958mm,2.53958mm">
                           <w:txbxContent>
@@ -6592,7 +6686,7 @@
                           </w:txbxContent>
                         </v:textbox>
                       </v:shape>
-                      <v:oval id="Oval 34607497" o:spid="_x0000_s1028" style="position:absolute;left:20487;top:2795;width:5283;height:5283;visibility:visible;mso-wrap-style:square;v-text-anchor:middle" o:gfxdata="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" fillcolor="#eee" strokecolor="#595959">
+                      <v:oval id="Oval 1485675434" o:spid="_x0000_s1028" style="position:absolute;left:21338;top:-486;width:5283;height:5282;visibility:visible;mso-wrap-style:square;v-text-anchor:middle" o:gfxdata="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" fillcolor="#eee" strokecolor="#595959">
                         <v:stroke startarrowwidth="narrow" startarrowlength="short" endarrowwidth="narrow" endarrowlength="short"/>
                         <v:textbox inset="2.53958mm,2.53958mm,2.53958mm,2.53958mm">
                           <w:txbxContent>
@@ -6633,7 +6727,7 @@
     </w:p>
     <w:tbl>
       <w:tblPr>
-        <w:tblStyle w:val="14"/>
+        <w:tblStyle w:val="aff5"/>
         <w:tblW w:w="9360" w:type="dxa"/>
         <w:tblInd w:w="0" w:type="dxa"/>
         <w:tblBorders>
@@ -6729,7 +6823,7 @@
     <w:p/>
     <w:tbl>
       <w:tblPr>
-        <w:tblStyle w:val="13"/>
+        <w:tblStyle w:val="aff6"/>
         <w:tblW w:w="9360" w:type="dxa"/>
         <w:tblInd w:w="0" w:type="dxa"/>
         <w:tblBorders>
@@ -6793,7 +6887,7 @@
     </w:p>
     <w:tbl>
       <w:tblPr>
-        <w:tblStyle w:val="12"/>
+        <w:tblStyle w:val="aff7"/>
         <w:tblW w:w="9360" w:type="dxa"/>
         <w:tblInd w:w="0" w:type="dxa"/>
         <w:tblBorders>
@@ -6839,19 +6933,7 @@
               <w:rPr>
                 <w:highlight w:val="yellow"/>
               </w:rPr>
-              <w:t>[</w:t>
-            </w:r>
-            <w:r>
-              <w:rPr>
-                <w:highlight w:val="yellow"/>
-              </w:rPr>
-              <w:t>11-14, 15-18 years old students</w:t>
-            </w:r>
-            <w:r>
-              <w:rPr>
-                <w:highlight w:val="yellow"/>
-              </w:rPr>
-              <w:t>]</w:t>
+              <w:t>[primary school children]</w:t>
             </w:r>
             <w:r>
               <w:t xml:space="preserve"> mobilities do you suggest for this project?</w:t>
@@ -6888,7 +6970,7 @@
     <w:p/>
     <w:tbl>
       <w:tblPr>
-        <w:tblStyle w:val="11"/>
+        <w:tblStyle w:val="aff8"/>
         <w:tblW w:w="9360" w:type="dxa"/>
         <w:tblInd w:w="0" w:type="dxa"/>
         <w:tblBorders>
@@ -6937,7 +7019,15 @@
             <w:bookmarkStart w:id="16" w:name="_f8u5x5k21npi" w:colFirst="0" w:colLast="0"/>
             <w:bookmarkEnd w:id="16"/>
             <w:r>
-              <w:t>Small-scale or Large scale project?</w:t>
+              <w:t xml:space="preserve">Small-scale or </w:t>
+            </w:r>
+            <w:proofErr w:type="gramStart"/>
+            <w:r>
+              <w:t>Large scale</w:t>
+            </w:r>
+            <w:proofErr w:type="gramEnd"/>
+            <w:r>
+              <w:t xml:space="preserve"> project?</w:t>
             </w:r>
           </w:p>
         </w:tc>
@@ -6956,7 +7046,21 @@
         <w:rPr>
           <w:b/>
         </w:rPr>
-        <w:t>Small Scale - 60.000 Eur:</w:t>
+        <w:t xml:space="preserve">Small Scale - 60.000 </w:t>
+      </w:r>
+      <w:proofErr w:type="spellStart"/>
+      <w:r>
+        <w:rPr>
+          <w:b/>
+        </w:rPr>
+        <w:t>Eur</w:t>
+      </w:r>
+      <w:proofErr w:type="spellEnd"/>
+      <w:r>
+        <w:rPr>
+          <w:b/>
+        </w:rPr>
+        <w:t>:</w:t>
       </w:r>
     </w:p>
     <w:p>
@@ -6999,7 +7103,7 @@
     </w:p>
     <w:tbl>
       <w:tblPr>
-        <w:tblStyle w:val="10"/>
+        <w:tblStyle w:val="aff9"/>
         <w:tblW w:w="9360" w:type="dxa"/>
         <w:tblInd w:w="0" w:type="dxa"/>
         <w:tblBorders>
@@ -7069,7 +7173,7 @@
     <w:p/>
     <w:tbl>
       <w:tblPr>
-        <w:tblStyle w:val="9"/>
+        <w:tblStyle w:val="affa"/>
         <w:tblW w:w="9360" w:type="dxa"/>
         <w:tblInd w:w="0" w:type="dxa"/>
         <w:tblBorders>
@@ -7128,7 +7232,7 @@
     <w:p/>
     <w:tbl>
       <w:tblPr>
-        <w:tblStyle w:val="8"/>
+        <w:tblStyle w:val="affb"/>
         <w:tblW w:w="9360" w:type="dxa"/>
         <w:tblInd w:w="0" w:type="dxa"/>
         <w:tblBorders>
@@ -7179,7 +7283,7 @@
     </w:p>
     <w:tbl>
       <w:tblPr>
-        <w:tblStyle w:val="7"/>
+        <w:tblStyle w:val="affc"/>
         <w:tblW w:w="9465" w:type="dxa"/>
         <w:tblInd w:w="-60" w:type="dxa"/>
         <w:tblBorders>
@@ -7970,7 +8074,7 @@
     <w:p/>
     <w:tbl>
       <w:tblPr>
-        <w:tblStyle w:val="6"/>
+        <w:tblStyle w:val="affd"/>
         <w:tblW w:w="9360" w:type="dxa"/>
         <w:tblInd w:w="0" w:type="dxa"/>
         <w:tblBorders>
@@ -8028,7 +8132,7 @@
     <w:p/>
     <w:tbl>
       <w:tblPr>
-        <w:tblStyle w:val="5"/>
+        <w:tblStyle w:val="affe"/>
         <w:tblW w:w="9360" w:type="dxa"/>
         <w:tblInd w:w="0" w:type="dxa"/>
         <w:tblBorders>
@@ -8065,7 +8169,21 @@
               <w:rPr>
                 <w:highlight w:val="yellow"/>
               </w:rPr>
-              <w:t xml:space="preserve">[ xxxxx €], </w:t>
+              <w:t xml:space="preserve">[ </w:t>
+            </w:r>
+            <w:proofErr w:type="spellStart"/>
+            <w:r>
+              <w:rPr>
+                <w:highlight w:val="yellow"/>
+              </w:rPr>
+              <w:t>xxxxx</w:t>
+            </w:r>
+            <w:proofErr w:type="spellEnd"/>
+            <w:r>
+              <w:rPr>
+                <w:highlight w:val="yellow"/>
+              </w:rPr>
+              <w:t xml:space="preserve"> €], </w:t>
             </w:r>
             <w:r>
               <w:t xml:space="preserve">considering good practices on the Erasmus+ Results platform, considering the evaluation manual of Erasmus+, can you propose qualitative and quantitative indicators with numbers for this project? Please consider that Erasmus+ promotes green practices and digitalisation to minimise environmental impact. </w:t>
@@ -8113,7 +8231,7 @@
     <w:p/>
     <w:tbl>
       <w:tblPr>
-        <w:tblStyle w:val="4"/>
+        <w:tblStyle w:val="afff"/>
         <w:tblW w:w="9360" w:type="dxa"/>
         <w:tblInd w:w="0" w:type="dxa"/>
         <w:tblBorders>
@@ -8171,7 +8289,7 @@
     <w:p/>
     <w:tbl>
       <w:tblPr>
-        <w:tblStyle w:val="3"/>
+        <w:tblStyle w:val="afff0"/>
         <w:tblW w:w="9360" w:type="dxa"/>
         <w:tblInd w:w="0" w:type="dxa"/>
         <w:tblBorders>
@@ -8247,7 +8365,7 @@
     <w:p/>
     <w:tbl>
       <w:tblPr>
-        <w:tblStyle w:val="2"/>
+        <w:tblStyle w:val="afff1"/>
         <w:tblW w:w="9360" w:type="dxa"/>
         <w:tblInd w:w="0" w:type="dxa"/>
         <w:tblBorders>
@@ -8305,7 +8423,7 @@
     <w:p/>
     <w:tbl>
       <w:tblPr>
-        <w:tblStyle w:val="1"/>
+        <w:tblStyle w:val="afff2"/>
         <w:tblW w:w="9360" w:type="dxa"/>
         <w:tblInd w:w="0" w:type="dxa"/>
         <w:tblBorders>
@@ -8339,7 +8457,15 @@
               <w:jc w:val="left"/>
             </w:pPr>
             <w:r>
-              <w:t>Create five potential high-quality project names for this project in the form like this "MindCrafters: Building Cognitive Skills through Real-World Scenarios"</w:t>
+              <w:t>Create five potential high-quality project names for this project in the form like this "</w:t>
+            </w:r>
+            <w:proofErr w:type="spellStart"/>
+            <w:r>
+              <w:t>MindCrafters</w:t>
+            </w:r>
+            <w:proofErr w:type="spellEnd"/>
+            <w:r>
+              <w:t>: Building Cognitive Skills through Real-World Scenarios"</w:t>
             </w:r>
           </w:p>
         </w:tc>
@@ -8416,9 +8542,9 @@
       </w:pPr>
     </w:p>
     <w:sectPr>
-      <w:footerReference w:type="default" r:id="rId12"/>
-      <w:headerReference w:type="first" r:id="rId13"/>
-      <w:footerReference w:type="first" r:id="rId14"/>
+      <w:footerReference w:type="default" r:id="rId13"/>
+      <w:headerReference w:type="first" r:id="rId14"/>
+      <w:footerReference w:type="first" r:id="rId15"/>
       <w:pgSz w:w="12240" w:h="15840"/>
       <w:pgMar w:top="1440" w:right="1440" w:bottom="1440" w:left="1440" w:header="0" w:footer="720" w:gutter="0"/>
       <w:pgNumType w:start="1"/>
@@ -8516,7 +8642,7 @@
         <w:noProof/>
       </w:rPr>
       <w:drawing>
-        <wp:inline distT="114300" distB="114300" distL="114300" distR="114300" wp14:anchorId="2CC2A070" wp14:editId="4191A72E">
+        <wp:inline distT="114300" distB="114300" distL="114300" distR="114300" wp14:anchorId="25EFDF8B" wp14:editId="7E5F92FC">
           <wp:extent cx="5943600" cy="1244600"/>
           <wp:effectExtent l="0" t="0" r="0" b="0"/>
           <wp:docPr id="2" name="image1.png"/>
@@ -8561,7 +8687,7 @@
       </w:rPr>
     </w:pPr>
     <w:r>
-      <w:pict w14:anchorId="0BC755EC">
+      <w:pict w14:anchorId="3396D64B">
         <v:rect id="_x0000_i1026" style="width:0;height:1.5pt" o:hralign="center" o:hrstd="t" o:hr="t" fillcolor="#a0a0a0" stroked="f"/>
       </w:pict>
     </w:r>
@@ -8588,9 +8714,687 @@
 <file path=word/numbering.xml><?xml version="1.0" encoding="utf-8"?>
 <w:numbering xmlns:wpc="http://schemas.microsoft.com/office/word/2010/wordprocessingCanvas" xmlns:cx="http://schemas.microsoft.com/office/drawing/2014/chartex" xmlns:cx1="http://schemas.microsoft.com/office/drawing/2015/9/8/chartex" xmlns:cx2="http://schemas.microsoft.com/office/drawing/2015/10/21/chartex" xmlns:cx3="http://schemas.microsoft.com/office/drawing/2016/5/9/chartex" xmlns:cx4="http://schemas.microsoft.com/office/drawing/2016/5/10/chartex" xmlns:cx5="http://schemas.microsoft.com/office/drawing/2016/5/11/chartex" xmlns:cx6="http://schemas.microsoft.com/office/drawing/2016/5/12/chartex" xmlns:cx7="http://schemas.microsoft.com/office/drawing/2016/5/13/chartex" xmlns:cx8="http://schemas.microsoft.com/office/drawing/2016/5/14/chartex" xmlns:mc="http://schemas.openxmlformats.org/markup-compatibility/2006" xmlns:aink="http://schemas.microsoft.com/office/drawing/2016/ink" xmlns:am3d="http://schemas.microsoft.com/office/drawing/2017/model3d" xmlns:o="urn:schemas-microsoft-com:office:office" xmlns:oel="http://schemas.microsoft.com/office/2019/extlst" xmlns:r="http://schemas.openxmlformats.org/officeDocument/2006/relationships" xmlns:m="http://schemas.openxmlformats.org/officeDocument/2006/math" xmlns:v="urn:schemas-microsoft-com:vml" xmlns:wp14="http://schemas.microsoft.com/office/word/2010/wordprocessingDrawing" xmlns:wp="http://schemas.openxmlformats.org/drawingml/2006/wordprocessingDrawing" xmlns:w10="urn:schemas-microsoft-com:office:word" xmlns:w="http://schemas.openxmlformats.org/wordprocessingml/2006/main" xmlns:w14="http://schemas.microsoft.com/office/word/2010/wordml" xmlns:w15="http://schemas.microsoft.com/office/word/2012/wordml" xmlns:w16cex="http://schemas.microsoft.com/office/word/2018/wordml/cex" xmlns:w16cid="http://schemas.microsoft.com/office/word/2016/wordml/cid" xmlns:w16="http://schemas.microsoft.com/office/word/2018/wordml" xmlns:w16du="http://schemas.microsoft.com/office/word/2023/wordml/word16du" xmlns:w16sdtdh="http://schemas.microsoft.com/office/word/2020/wordml/sdtdatahash" xmlns:w16sdtfl="http://schemas.microsoft.com/office/word/2024/wordml/sdtformatlock" xmlns:w16se="http://schemas.microsoft.com/office/word/2015/wordml/symex" xmlns:wpg="http://schemas.microsoft.com/office/word/2010/wordprocessingGroup" xmlns:wpi="http://schemas.microsoft.com/office/word/2010/wordprocessingInk" xmlns:wne="http://schemas.microsoft.com/office/word/2006/wordml" xmlns:wps="http://schemas.microsoft.com/office/word/2010/wordprocessingShape" mc:Ignorable="w14 w15 w16se w16cid w16 w16cex w16sdtdh w16sdtfl w16du wp14">
   <w:abstractNum w:abstractNumId="0" w15:restartNumberingAfterBreak="0">
-    <w:nsid w:val="009160F4"/>
+    <w:nsid w:val="093B3CF4"/>
     <w:multiLevelType w:val="multilevel"/>
-    <w:tmpl w:val="70501AEC"/>
+    <w:tmpl w:val="2B1E83FE"/>
+    <w:lvl w:ilvl="0">
+      <w:start w:val="1"/>
+      <w:numFmt w:val="decimal"/>
+      <w:lvlText w:val="%1."/>
+      <w:lvlJc w:val="left"/>
+      <w:pPr>
+        <w:ind w:left="720" w:hanging="360"/>
+      </w:pPr>
+      <w:rPr>
+        <w:u w:val="none"/>
+      </w:rPr>
+    </w:lvl>
+    <w:lvl w:ilvl="1">
+      <w:start w:val="1"/>
+      <w:numFmt w:val="lowerLetter"/>
+      <w:lvlText w:val="%2."/>
+      <w:lvlJc w:val="left"/>
+      <w:pPr>
+        <w:ind w:left="1440" w:hanging="360"/>
+      </w:pPr>
+      <w:rPr>
+        <w:u w:val="none"/>
+      </w:rPr>
+    </w:lvl>
+    <w:lvl w:ilvl="2">
+      <w:start w:val="1"/>
+      <w:numFmt w:val="lowerRoman"/>
+      <w:lvlText w:val="%3."/>
+      <w:lvlJc w:val="right"/>
+      <w:pPr>
+        <w:ind w:left="2160" w:hanging="360"/>
+      </w:pPr>
+      <w:rPr>
+        <w:u w:val="none"/>
+      </w:rPr>
+    </w:lvl>
+    <w:lvl w:ilvl="3">
+      <w:start w:val="1"/>
+      <w:numFmt w:val="decimal"/>
+      <w:lvlText w:val="%4."/>
+      <w:lvlJc w:val="left"/>
+      <w:pPr>
+        <w:ind w:left="2880" w:hanging="360"/>
+      </w:pPr>
+      <w:rPr>
+        <w:u w:val="none"/>
+      </w:rPr>
+    </w:lvl>
+    <w:lvl w:ilvl="4">
+      <w:start w:val="1"/>
+      <w:numFmt w:val="lowerLetter"/>
+      <w:lvlText w:val="%5."/>
+      <w:lvlJc w:val="left"/>
+      <w:pPr>
+        <w:ind w:left="3600" w:hanging="360"/>
+      </w:pPr>
+      <w:rPr>
+        <w:u w:val="none"/>
+      </w:rPr>
+    </w:lvl>
+    <w:lvl w:ilvl="5">
+      <w:start w:val="1"/>
+      <w:numFmt w:val="lowerRoman"/>
+      <w:lvlText w:val="%6."/>
+      <w:lvlJc w:val="right"/>
+      <w:pPr>
+        <w:ind w:left="4320" w:hanging="360"/>
+      </w:pPr>
+      <w:rPr>
+        <w:u w:val="none"/>
+      </w:rPr>
+    </w:lvl>
+    <w:lvl w:ilvl="6">
+      <w:start w:val="1"/>
+      <w:numFmt w:val="decimal"/>
+      <w:lvlText w:val="%7."/>
+      <w:lvlJc w:val="left"/>
+      <w:pPr>
+        <w:ind w:left="5040" w:hanging="360"/>
+      </w:pPr>
+      <w:rPr>
+        <w:u w:val="none"/>
+      </w:rPr>
+    </w:lvl>
+    <w:lvl w:ilvl="7">
+      <w:start w:val="1"/>
+      <w:numFmt w:val="lowerLetter"/>
+      <w:lvlText w:val="%8."/>
+      <w:lvlJc w:val="left"/>
+      <w:pPr>
+        <w:ind w:left="5760" w:hanging="360"/>
+      </w:pPr>
+      <w:rPr>
+        <w:u w:val="none"/>
+      </w:rPr>
+    </w:lvl>
+    <w:lvl w:ilvl="8">
+      <w:start w:val="1"/>
+      <w:numFmt w:val="lowerRoman"/>
+      <w:lvlText w:val="%9."/>
+      <w:lvlJc w:val="right"/>
+      <w:pPr>
+        <w:ind w:left="6480" w:hanging="360"/>
+      </w:pPr>
+      <w:rPr>
+        <w:u w:val="none"/>
+      </w:rPr>
+    </w:lvl>
+  </w:abstractNum>
+  <w:abstractNum w:abstractNumId="1" w15:restartNumberingAfterBreak="0">
+    <w:nsid w:val="19B27AAA"/>
+    <w:multiLevelType w:val="multilevel"/>
+    <w:tmpl w:val="237CA698"/>
+    <w:lvl w:ilvl="0">
+      <w:start w:val="1"/>
+      <w:numFmt w:val="bullet"/>
+      <w:lvlText w:val="-"/>
+      <w:lvlJc w:val="left"/>
+      <w:pPr>
+        <w:ind w:left="720" w:hanging="360"/>
+      </w:pPr>
+      <w:rPr>
+        <w:u w:val="none"/>
+      </w:rPr>
+    </w:lvl>
+    <w:lvl w:ilvl="1">
+      <w:start w:val="1"/>
+      <w:numFmt w:val="bullet"/>
+      <w:lvlText w:val="-"/>
+      <w:lvlJc w:val="left"/>
+      <w:pPr>
+        <w:ind w:left="1440" w:hanging="360"/>
+      </w:pPr>
+      <w:rPr>
+        <w:u w:val="none"/>
+      </w:rPr>
+    </w:lvl>
+    <w:lvl w:ilvl="2">
+      <w:start w:val="1"/>
+      <w:numFmt w:val="bullet"/>
+      <w:lvlText w:val="-"/>
+      <w:lvlJc w:val="left"/>
+      <w:pPr>
+        <w:ind w:left="2160" w:hanging="360"/>
+      </w:pPr>
+      <w:rPr>
+        <w:u w:val="none"/>
+      </w:rPr>
+    </w:lvl>
+    <w:lvl w:ilvl="3">
+      <w:start w:val="1"/>
+      <w:numFmt w:val="bullet"/>
+      <w:lvlText w:val="-"/>
+      <w:lvlJc w:val="left"/>
+      <w:pPr>
+        <w:ind w:left="2880" w:hanging="360"/>
+      </w:pPr>
+      <w:rPr>
+        <w:u w:val="none"/>
+      </w:rPr>
+    </w:lvl>
+    <w:lvl w:ilvl="4">
+      <w:start w:val="1"/>
+      <w:numFmt w:val="bullet"/>
+      <w:lvlText w:val="-"/>
+      <w:lvlJc w:val="left"/>
+      <w:pPr>
+        <w:ind w:left="3600" w:hanging="360"/>
+      </w:pPr>
+      <w:rPr>
+        <w:u w:val="none"/>
+      </w:rPr>
+    </w:lvl>
+    <w:lvl w:ilvl="5">
+      <w:start w:val="1"/>
+      <w:numFmt w:val="bullet"/>
+      <w:lvlText w:val="-"/>
+      <w:lvlJc w:val="left"/>
+      <w:pPr>
+        <w:ind w:left="4320" w:hanging="360"/>
+      </w:pPr>
+      <w:rPr>
+        <w:u w:val="none"/>
+      </w:rPr>
+    </w:lvl>
+    <w:lvl w:ilvl="6">
+      <w:start w:val="1"/>
+      <w:numFmt w:val="bullet"/>
+      <w:lvlText w:val="-"/>
+      <w:lvlJc w:val="left"/>
+      <w:pPr>
+        <w:ind w:left="5040" w:hanging="360"/>
+      </w:pPr>
+      <w:rPr>
+        <w:u w:val="none"/>
+      </w:rPr>
+    </w:lvl>
+    <w:lvl w:ilvl="7">
+      <w:start w:val="1"/>
+      <w:numFmt w:val="bullet"/>
+      <w:lvlText w:val="-"/>
+      <w:lvlJc w:val="left"/>
+      <w:pPr>
+        <w:ind w:left="5760" w:hanging="360"/>
+      </w:pPr>
+      <w:rPr>
+        <w:u w:val="none"/>
+      </w:rPr>
+    </w:lvl>
+    <w:lvl w:ilvl="8">
+      <w:start w:val="1"/>
+      <w:numFmt w:val="bullet"/>
+      <w:lvlText w:val="-"/>
+      <w:lvlJc w:val="left"/>
+      <w:pPr>
+        <w:ind w:left="6480" w:hanging="360"/>
+      </w:pPr>
+      <w:rPr>
+        <w:u w:val="none"/>
+      </w:rPr>
+    </w:lvl>
+  </w:abstractNum>
+  <w:abstractNum w:abstractNumId="2" w15:restartNumberingAfterBreak="0">
+    <w:nsid w:val="23523DE1"/>
+    <w:multiLevelType w:val="multilevel"/>
+    <w:tmpl w:val="3EBE7D24"/>
+    <w:lvl w:ilvl="0">
+      <w:start w:val="1"/>
+      <w:numFmt w:val="bullet"/>
+      <w:lvlText w:val="●"/>
+      <w:lvlJc w:val="left"/>
+      <w:pPr>
+        <w:ind w:left="720" w:hanging="360"/>
+      </w:pPr>
+      <w:rPr>
+        <w:u w:val="none"/>
+      </w:rPr>
+    </w:lvl>
+    <w:lvl w:ilvl="1">
+      <w:start w:val="1"/>
+      <w:numFmt w:val="bullet"/>
+      <w:lvlText w:val="○"/>
+      <w:lvlJc w:val="left"/>
+      <w:pPr>
+        <w:ind w:left="1440" w:hanging="360"/>
+      </w:pPr>
+      <w:rPr>
+        <w:u w:val="none"/>
+      </w:rPr>
+    </w:lvl>
+    <w:lvl w:ilvl="2">
+      <w:start w:val="1"/>
+      <w:numFmt w:val="bullet"/>
+      <w:lvlText w:val="■"/>
+      <w:lvlJc w:val="left"/>
+      <w:pPr>
+        <w:ind w:left="2160" w:hanging="360"/>
+      </w:pPr>
+      <w:rPr>
+        <w:u w:val="none"/>
+      </w:rPr>
+    </w:lvl>
+    <w:lvl w:ilvl="3">
+      <w:start w:val="1"/>
+      <w:numFmt w:val="bullet"/>
+      <w:lvlText w:val="●"/>
+      <w:lvlJc w:val="left"/>
+      <w:pPr>
+        <w:ind w:left="2880" w:hanging="360"/>
+      </w:pPr>
+      <w:rPr>
+        <w:u w:val="none"/>
+      </w:rPr>
+    </w:lvl>
+    <w:lvl w:ilvl="4">
+      <w:start w:val="1"/>
+      <w:numFmt w:val="bullet"/>
+      <w:lvlText w:val="○"/>
+      <w:lvlJc w:val="left"/>
+      <w:pPr>
+        <w:ind w:left="3600" w:hanging="360"/>
+      </w:pPr>
+      <w:rPr>
+        <w:u w:val="none"/>
+      </w:rPr>
+    </w:lvl>
+    <w:lvl w:ilvl="5">
+      <w:start w:val="1"/>
+      <w:numFmt w:val="bullet"/>
+      <w:lvlText w:val="■"/>
+      <w:lvlJc w:val="left"/>
+      <w:pPr>
+        <w:ind w:left="4320" w:hanging="360"/>
+      </w:pPr>
+      <w:rPr>
+        <w:u w:val="none"/>
+      </w:rPr>
+    </w:lvl>
+    <w:lvl w:ilvl="6">
+      <w:start w:val="1"/>
+      <w:numFmt w:val="bullet"/>
+      <w:lvlText w:val="●"/>
+      <w:lvlJc w:val="left"/>
+      <w:pPr>
+        <w:ind w:left="5040" w:hanging="360"/>
+      </w:pPr>
+      <w:rPr>
+        <w:u w:val="none"/>
+      </w:rPr>
+    </w:lvl>
+    <w:lvl w:ilvl="7">
+      <w:start w:val="1"/>
+      <w:numFmt w:val="bullet"/>
+      <w:lvlText w:val="○"/>
+      <w:lvlJc w:val="left"/>
+      <w:pPr>
+        <w:ind w:left="5760" w:hanging="360"/>
+      </w:pPr>
+      <w:rPr>
+        <w:u w:val="none"/>
+      </w:rPr>
+    </w:lvl>
+    <w:lvl w:ilvl="8">
+      <w:start w:val="1"/>
+      <w:numFmt w:val="bullet"/>
+      <w:lvlText w:val="■"/>
+      <w:lvlJc w:val="left"/>
+      <w:pPr>
+        <w:ind w:left="6480" w:hanging="360"/>
+      </w:pPr>
+      <w:rPr>
+        <w:u w:val="none"/>
+      </w:rPr>
+    </w:lvl>
+  </w:abstractNum>
+  <w:abstractNum w:abstractNumId="3" w15:restartNumberingAfterBreak="0">
+    <w:nsid w:val="29014363"/>
+    <w:multiLevelType w:val="multilevel"/>
+    <w:tmpl w:val="F7BA22FA"/>
+    <w:lvl w:ilvl="0">
+      <w:start w:val="1"/>
+      <w:numFmt w:val="bullet"/>
+      <w:lvlText w:val="●"/>
+      <w:lvlJc w:val="left"/>
+      <w:pPr>
+        <w:ind w:left="720" w:hanging="360"/>
+      </w:pPr>
+      <w:rPr>
+        <w:u w:val="none"/>
+      </w:rPr>
+    </w:lvl>
+    <w:lvl w:ilvl="1">
+      <w:start w:val="1"/>
+      <w:numFmt w:val="bullet"/>
+      <w:lvlText w:val="●"/>
+      <w:lvlJc w:val="left"/>
+      <w:pPr>
+        <w:ind w:left="1440" w:hanging="360"/>
+      </w:pPr>
+      <w:rPr>
+        <w:u w:val="none"/>
+      </w:rPr>
+    </w:lvl>
+    <w:lvl w:ilvl="2">
+      <w:start w:val="1"/>
+      <w:numFmt w:val="bullet"/>
+      <w:lvlText w:val="●"/>
+      <w:lvlJc w:val="left"/>
+      <w:pPr>
+        <w:ind w:left="2160" w:hanging="360"/>
+      </w:pPr>
+      <w:rPr>
+        <w:u w:val="none"/>
+      </w:rPr>
+    </w:lvl>
+    <w:lvl w:ilvl="3">
+      <w:start w:val="1"/>
+      <w:numFmt w:val="bullet"/>
+      <w:lvlText w:val="●"/>
+      <w:lvlJc w:val="left"/>
+      <w:pPr>
+        <w:ind w:left="2880" w:hanging="360"/>
+      </w:pPr>
+      <w:rPr>
+        <w:u w:val="none"/>
+      </w:rPr>
+    </w:lvl>
+    <w:lvl w:ilvl="4">
+      <w:start w:val="1"/>
+      <w:numFmt w:val="bullet"/>
+      <w:lvlText w:val="●"/>
+      <w:lvlJc w:val="left"/>
+      <w:pPr>
+        <w:ind w:left="3600" w:hanging="360"/>
+      </w:pPr>
+      <w:rPr>
+        <w:u w:val="none"/>
+      </w:rPr>
+    </w:lvl>
+    <w:lvl w:ilvl="5">
+      <w:start w:val="1"/>
+      <w:numFmt w:val="bullet"/>
+      <w:lvlText w:val="●"/>
+      <w:lvlJc w:val="left"/>
+      <w:pPr>
+        <w:ind w:left="4320" w:hanging="360"/>
+      </w:pPr>
+      <w:rPr>
+        <w:u w:val="none"/>
+      </w:rPr>
+    </w:lvl>
+    <w:lvl w:ilvl="6">
+      <w:start w:val="1"/>
+      <w:numFmt w:val="bullet"/>
+      <w:lvlText w:val="●"/>
+      <w:lvlJc w:val="left"/>
+      <w:pPr>
+        <w:ind w:left="5040" w:hanging="360"/>
+      </w:pPr>
+      <w:rPr>
+        <w:u w:val="none"/>
+      </w:rPr>
+    </w:lvl>
+    <w:lvl w:ilvl="7">
+      <w:start w:val="1"/>
+      <w:numFmt w:val="bullet"/>
+      <w:lvlText w:val="●"/>
+      <w:lvlJc w:val="left"/>
+      <w:pPr>
+        <w:ind w:left="5760" w:hanging="360"/>
+      </w:pPr>
+      <w:rPr>
+        <w:u w:val="none"/>
+      </w:rPr>
+    </w:lvl>
+    <w:lvl w:ilvl="8">
+      <w:start w:val="1"/>
+      <w:numFmt w:val="bullet"/>
+      <w:lvlText w:val="●"/>
+      <w:lvlJc w:val="left"/>
+      <w:pPr>
+        <w:ind w:left="6480" w:hanging="360"/>
+      </w:pPr>
+      <w:rPr>
+        <w:u w:val="none"/>
+      </w:rPr>
+    </w:lvl>
+  </w:abstractNum>
+  <w:abstractNum w:abstractNumId="4" w15:restartNumberingAfterBreak="0">
+    <w:nsid w:val="46F62133"/>
+    <w:multiLevelType w:val="multilevel"/>
+    <w:tmpl w:val="A2C04138"/>
+    <w:lvl w:ilvl="0">
+      <w:start w:val="1"/>
+      <w:numFmt w:val="bullet"/>
+      <w:lvlText w:val="●"/>
+      <w:lvlJc w:val="left"/>
+      <w:pPr>
+        <w:ind w:left="720" w:hanging="360"/>
+      </w:pPr>
+      <w:rPr>
+        <w:u w:val="none"/>
+      </w:rPr>
+    </w:lvl>
+    <w:lvl w:ilvl="1">
+      <w:start w:val="1"/>
+      <w:numFmt w:val="bullet"/>
+      <w:lvlText w:val="○"/>
+      <w:lvlJc w:val="left"/>
+      <w:pPr>
+        <w:ind w:left="1440" w:hanging="360"/>
+      </w:pPr>
+      <w:rPr>
+        <w:u w:val="none"/>
+      </w:rPr>
+    </w:lvl>
+    <w:lvl w:ilvl="2">
+      <w:start w:val="1"/>
+      <w:numFmt w:val="bullet"/>
+      <w:lvlText w:val="■"/>
+      <w:lvlJc w:val="left"/>
+      <w:pPr>
+        <w:ind w:left="2160" w:hanging="360"/>
+      </w:pPr>
+      <w:rPr>
+        <w:u w:val="none"/>
+      </w:rPr>
+    </w:lvl>
+    <w:lvl w:ilvl="3">
+      <w:start w:val="1"/>
+      <w:numFmt w:val="bullet"/>
+      <w:lvlText w:val="●"/>
+      <w:lvlJc w:val="left"/>
+      <w:pPr>
+        <w:ind w:left="2880" w:hanging="360"/>
+      </w:pPr>
+      <w:rPr>
+        <w:u w:val="none"/>
+      </w:rPr>
+    </w:lvl>
+    <w:lvl w:ilvl="4">
+      <w:start w:val="1"/>
+      <w:numFmt w:val="bullet"/>
+      <w:lvlText w:val="○"/>
+      <w:lvlJc w:val="left"/>
+      <w:pPr>
+        <w:ind w:left="3600" w:hanging="360"/>
+      </w:pPr>
+      <w:rPr>
+        <w:u w:val="none"/>
+      </w:rPr>
+    </w:lvl>
+    <w:lvl w:ilvl="5">
+      <w:start w:val="1"/>
+      <w:numFmt w:val="bullet"/>
+      <w:lvlText w:val="■"/>
+      <w:lvlJc w:val="left"/>
+      <w:pPr>
+        <w:ind w:left="4320" w:hanging="360"/>
+      </w:pPr>
+      <w:rPr>
+        <w:u w:val="none"/>
+      </w:rPr>
+    </w:lvl>
+    <w:lvl w:ilvl="6">
+      <w:start w:val="1"/>
+      <w:numFmt w:val="bullet"/>
+      <w:lvlText w:val="●"/>
+      <w:lvlJc w:val="left"/>
+      <w:pPr>
+        <w:ind w:left="5040" w:hanging="360"/>
+      </w:pPr>
+      <w:rPr>
+        <w:u w:val="none"/>
+      </w:rPr>
+    </w:lvl>
+    <w:lvl w:ilvl="7">
+      <w:start w:val="1"/>
+      <w:numFmt w:val="bullet"/>
+      <w:lvlText w:val="○"/>
+      <w:lvlJc w:val="left"/>
+      <w:pPr>
+        <w:ind w:left="5760" w:hanging="360"/>
+      </w:pPr>
+      <w:rPr>
+        <w:u w:val="none"/>
+      </w:rPr>
+    </w:lvl>
+    <w:lvl w:ilvl="8">
+      <w:start w:val="1"/>
+      <w:numFmt w:val="bullet"/>
+      <w:lvlText w:val="■"/>
+      <w:lvlJc w:val="left"/>
+      <w:pPr>
+        <w:ind w:left="6480" w:hanging="360"/>
+      </w:pPr>
+      <w:rPr>
+        <w:u w:val="none"/>
+      </w:rPr>
+    </w:lvl>
+  </w:abstractNum>
+  <w:abstractNum w:abstractNumId="5" w15:restartNumberingAfterBreak="0">
+    <w:nsid w:val="49DB2ADC"/>
+    <w:multiLevelType w:val="multilevel"/>
+    <w:tmpl w:val="C5E095A0"/>
+    <w:lvl w:ilvl="0">
+      <w:start w:val="1"/>
+      <w:numFmt w:val="bullet"/>
+      <w:lvlText w:val="●"/>
+      <w:lvlJc w:val="left"/>
+      <w:pPr>
+        <w:ind w:left="720" w:hanging="360"/>
+      </w:pPr>
+      <w:rPr>
+        <w:u w:val="none"/>
+      </w:rPr>
+    </w:lvl>
+    <w:lvl w:ilvl="1">
+      <w:start w:val="1"/>
+      <w:numFmt w:val="bullet"/>
+      <w:lvlText w:val="○"/>
+      <w:lvlJc w:val="left"/>
+      <w:pPr>
+        <w:ind w:left="1440" w:hanging="360"/>
+      </w:pPr>
+      <w:rPr>
+        <w:u w:val="none"/>
+      </w:rPr>
+    </w:lvl>
+    <w:lvl w:ilvl="2">
+      <w:start w:val="1"/>
+      <w:numFmt w:val="bullet"/>
+      <w:lvlText w:val="■"/>
+      <w:lvlJc w:val="left"/>
+      <w:pPr>
+        <w:ind w:left="2160" w:hanging="360"/>
+      </w:pPr>
+      <w:rPr>
+        <w:u w:val="none"/>
+      </w:rPr>
+    </w:lvl>
+    <w:lvl w:ilvl="3">
+      <w:start w:val="1"/>
+      <w:numFmt w:val="bullet"/>
+      <w:lvlText w:val="●"/>
+      <w:lvlJc w:val="left"/>
+      <w:pPr>
+        <w:ind w:left="2880" w:hanging="360"/>
+      </w:pPr>
+      <w:rPr>
+        <w:u w:val="none"/>
+      </w:rPr>
+    </w:lvl>
+    <w:lvl w:ilvl="4">
+      <w:start w:val="1"/>
+      <w:numFmt w:val="bullet"/>
+      <w:lvlText w:val="○"/>
+      <w:lvlJc w:val="left"/>
+      <w:pPr>
+        <w:ind w:left="3600" w:hanging="360"/>
+      </w:pPr>
+      <w:rPr>
+        <w:u w:val="none"/>
+      </w:rPr>
+    </w:lvl>
+    <w:lvl w:ilvl="5">
+      <w:start w:val="1"/>
+      <w:numFmt w:val="bullet"/>
+      <w:lvlText w:val="■"/>
+      <w:lvlJc w:val="left"/>
+      <w:pPr>
+        <w:ind w:left="4320" w:hanging="360"/>
+      </w:pPr>
+      <w:rPr>
+        <w:u w:val="none"/>
+      </w:rPr>
+    </w:lvl>
+    <w:lvl w:ilvl="6">
+      <w:start w:val="1"/>
+      <w:numFmt w:val="bullet"/>
+      <w:lvlText w:val="●"/>
+      <w:lvlJc w:val="left"/>
+      <w:pPr>
+        <w:ind w:left="5040" w:hanging="360"/>
+      </w:pPr>
+      <w:rPr>
+        <w:u w:val="none"/>
+      </w:rPr>
+    </w:lvl>
+    <w:lvl w:ilvl="7">
+      <w:start w:val="1"/>
+      <w:numFmt w:val="bullet"/>
+      <w:lvlText w:val="○"/>
+      <w:lvlJc w:val="left"/>
+      <w:pPr>
+        <w:ind w:left="5760" w:hanging="360"/>
+      </w:pPr>
+      <w:rPr>
+        <w:u w:val="none"/>
+      </w:rPr>
+    </w:lvl>
+    <w:lvl w:ilvl="8">
+      <w:start w:val="1"/>
+      <w:numFmt w:val="bullet"/>
+      <w:lvlText w:val="■"/>
+      <w:lvlJc w:val="left"/>
+      <w:pPr>
+        <w:ind w:left="6480" w:hanging="360"/>
+      </w:pPr>
+      <w:rPr>
+        <w:u w:val="none"/>
+      </w:rPr>
+    </w:lvl>
+  </w:abstractNum>
+  <w:abstractNum w:abstractNumId="6" w15:restartNumberingAfterBreak="0">
+    <w:nsid w:val="4E3C2734"/>
+    <w:multiLevelType w:val="multilevel"/>
+    <w:tmpl w:val="71681D1E"/>
     <w:lvl w:ilvl="0">
       <w:start w:val="1"/>
       <w:numFmt w:val="bullet"/>
@@ -8700,10 +9504,10 @@
       </w:rPr>
     </w:lvl>
   </w:abstractNum>
-  <w:abstractNum w:abstractNumId="1" w15:restartNumberingAfterBreak="0">
-    <w:nsid w:val="0AF8031C"/>
+  <w:abstractNum w:abstractNumId="7" w15:restartNumberingAfterBreak="0">
+    <w:nsid w:val="4E5E209B"/>
     <w:multiLevelType w:val="multilevel"/>
-    <w:tmpl w:val="1594164C"/>
+    <w:tmpl w:val="065C534E"/>
     <w:lvl w:ilvl="0">
       <w:start w:val="1"/>
       <w:numFmt w:val="bullet"/>
@@ -8719,7 +9523,7 @@
     <w:lvl w:ilvl="1">
       <w:start w:val="1"/>
       <w:numFmt w:val="bullet"/>
-      <w:lvlText w:val="○"/>
+      <w:lvlText w:val="●"/>
       <w:lvlJc w:val="left"/>
       <w:pPr>
         <w:ind w:left="1440" w:hanging="360"/>
@@ -8731,7 +9535,7 @@
     <w:lvl w:ilvl="2">
       <w:start w:val="1"/>
       <w:numFmt w:val="bullet"/>
-      <w:lvlText w:val="■"/>
+      <w:lvlText w:val="●"/>
       <w:lvlJc w:val="left"/>
       <w:pPr>
         <w:ind w:left="2160" w:hanging="360"/>
@@ -8755,7 +9559,7 @@
     <w:lvl w:ilvl="4">
       <w:start w:val="1"/>
       <w:numFmt w:val="bullet"/>
-      <w:lvlText w:val="○"/>
+      <w:lvlText w:val="●"/>
       <w:lvlJc w:val="left"/>
       <w:pPr>
         <w:ind w:left="3600" w:hanging="360"/>
@@ -8767,7 +9571,7 @@
     <w:lvl w:ilvl="5">
       <w:start w:val="1"/>
       <w:numFmt w:val="bullet"/>
-      <w:lvlText w:val="■"/>
+      <w:lvlText w:val="●"/>
       <w:lvlJc w:val="left"/>
       <w:pPr>
         <w:ind w:left="4320" w:hanging="360"/>
@@ -8791,119 +9595,6 @@
     <w:lvl w:ilvl="7">
       <w:start w:val="1"/>
       <w:numFmt w:val="bullet"/>
-      <w:lvlText w:val="○"/>
-      <w:lvlJc w:val="left"/>
-      <w:pPr>
-        <w:ind w:left="5760" w:hanging="360"/>
-      </w:pPr>
-      <w:rPr>
-        <w:u w:val="none"/>
-      </w:rPr>
-    </w:lvl>
-    <w:lvl w:ilvl="8">
-      <w:start w:val="1"/>
-      <w:numFmt w:val="bullet"/>
-      <w:lvlText w:val="■"/>
-      <w:lvlJc w:val="left"/>
-      <w:pPr>
-        <w:ind w:left="6480" w:hanging="360"/>
-      </w:pPr>
-      <w:rPr>
-        <w:u w:val="none"/>
-      </w:rPr>
-    </w:lvl>
-  </w:abstractNum>
-  <w:abstractNum w:abstractNumId="2" w15:restartNumberingAfterBreak="0">
-    <w:nsid w:val="0D495248"/>
-    <w:multiLevelType w:val="multilevel"/>
-    <w:tmpl w:val="B4220DD2"/>
-    <w:lvl w:ilvl="0">
-      <w:start w:val="1"/>
-      <w:numFmt w:val="bullet"/>
-      <w:lvlText w:val="●"/>
-      <w:lvlJc w:val="left"/>
-      <w:pPr>
-        <w:ind w:left="720" w:hanging="360"/>
-      </w:pPr>
-      <w:rPr>
-        <w:u w:val="none"/>
-      </w:rPr>
-    </w:lvl>
-    <w:lvl w:ilvl="1">
-      <w:start w:val="1"/>
-      <w:numFmt w:val="bullet"/>
-      <w:lvlText w:val="●"/>
-      <w:lvlJc w:val="left"/>
-      <w:pPr>
-        <w:ind w:left="1440" w:hanging="360"/>
-      </w:pPr>
-      <w:rPr>
-        <w:u w:val="none"/>
-      </w:rPr>
-    </w:lvl>
-    <w:lvl w:ilvl="2">
-      <w:start w:val="1"/>
-      <w:numFmt w:val="bullet"/>
-      <w:lvlText w:val="●"/>
-      <w:lvlJc w:val="left"/>
-      <w:pPr>
-        <w:ind w:left="2160" w:hanging="360"/>
-      </w:pPr>
-      <w:rPr>
-        <w:u w:val="none"/>
-      </w:rPr>
-    </w:lvl>
-    <w:lvl w:ilvl="3">
-      <w:start w:val="1"/>
-      <w:numFmt w:val="bullet"/>
-      <w:lvlText w:val="●"/>
-      <w:lvlJc w:val="left"/>
-      <w:pPr>
-        <w:ind w:left="2880" w:hanging="360"/>
-      </w:pPr>
-      <w:rPr>
-        <w:u w:val="none"/>
-      </w:rPr>
-    </w:lvl>
-    <w:lvl w:ilvl="4">
-      <w:start w:val="1"/>
-      <w:numFmt w:val="bullet"/>
-      <w:lvlText w:val="●"/>
-      <w:lvlJc w:val="left"/>
-      <w:pPr>
-        <w:ind w:left="3600" w:hanging="360"/>
-      </w:pPr>
-      <w:rPr>
-        <w:u w:val="none"/>
-      </w:rPr>
-    </w:lvl>
-    <w:lvl w:ilvl="5">
-      <w:start w:val="1"/>
-      <w:numFmt w:val="bullet"/>
-      <w:lvlText w:val="●"/>
-      <w:lvlJc w:val="left"/>
-      <w:pPr>
-        <w:ind w:left="4320" w:hanging="360"/>
-      </w:pPr>
-      <w:rPr>
-        <w:u w:val="none"/>
-      </w:rPr>
-    </w:lvl>
-    <w:lvl w:ilvl="6">
-      <w:start w:val="1"/>
-      <w:numFmt w:val="bullet"/>
-      <w:lvlText w:val="●"/>
-      <w:lvlJc w:val="left"/>
-      <w:pPr>
-        <w:ind w:left="5040" w:hanging="360"/>
-      </w:pPr>
-      <w:rPr>
-        <w:u w:val="none"/>
-      </w:rPr>
-    </w:lvl>
-    <w:lvl w:ilvl="7">
-      <w:start w:val="1"/>
-      <w:numFmt w:val="bullet"/>
       <w:lvlText w:val="●"/>
       <w:lvlJc w:val="left"/>
       <w:pPr>
@@ -8926,10 +9617,123 @@
       </w:rPr>
     </w:lvl>
   </w:abstractNum>
-  <w:abstractNum w:abstractNumId="3" w15:restartNumberingAfterBreak="0">
-    <w:nsid w:val="2972411E"/>
+  <w:abstractNum w:abstractNumId="8" w15:restartNumberingAfterBreak="0">
+    <w:nsid w:val="54DE0BF6"/>
     <w:multiLevelType w:val="multilevel"/>
-    <w:tmpl w:val="B86C7BC2"/>
+    <w:tmpl w:val="ECE23844"/>
+    <w:lvl w:ilvl="0">
+      <w:start w:val="1"/>
+      <w:numFmt w:val="decimal"/>
+      <w:lvlText w:val="%1."/>
+      <w:lvlJc w:val="left"/>
+      <w:pPr>
+        <w:ind w:left="720" w:hanging="360"/>
+      </w:pPr>
+      <w:rPr>
+        <w:u w:val="none"/>
+      </w:rPr>
+    </w:lvl>
+    <w:lvl w:ilvl="1">
+      <w:start w:val="1"/>
+      <w:numFmt w:val="lowerLetter"/>
+      <w:lvlText w:val="%2."/>
+      <w:lvlJc w:val="left"/>
+      <w:pPr>
+        <w:ind w:left="1440" w:hanging="360"/>
+      </w:pPr>
+      <w:rPr>
+        <w:u w:val="none"/>
+      </w:rPr>
+    </w:lvl>
+    <w:lvl w:ilvl="2">
+      <w:start w:val="1"/>
+      <w:numFmt w:val="lowerRoman"/>
+      <w:lvlText w:val="%3."/>
+      <w:lvlJc w:val="right"/>
+      <w:pPr>
+        <w:ind w:left="2160" w:hanging="360"/>
+      </w:pPr>
+      <w:rPr>
+        <w:u w:val="none"/>
+      </w:rPr>
+    </w:lvl>
+    <w:lvl w:ilvl="3">
+      <w:start w:val="1"/>
+      <w:numFmt w:val="decimal"/>
+      <w:lvlText w:val="%4."/>
+      <w:lvlJc w:val="left"/>
+      <w:pPr>
+        <w:ind w:left="2880" w:hanging="360"/>
+      </w:pPr>
+      <w:rPr>
+        <w:u w:val="none"/>
+      </w:rPr>
+    </w:lvl>
+    <w:lvl w:ilvl="4">
+      <w:start w:val="1"/>
+      <w:numFmt w:val="lowerLetter"/>
+      <w:lvlText w:val="%5."/>
+      <w:lvlJc w:val="left"/>
+      <w:pPr>
+        <w:ind w:left="3600" w:hanging="360"/>
+      </w:pPr>
+      <w:rPr>
+        <w:u w:val="none"/>
+      </w:rPr>
+    </w:lvl>
+    <w:lvl w:ilvl="5">
+      <w:start w:val="1"/>
+      <w:numFmt w:val="lowerRoman"/>
+      <w:lvlText w:val="%6."/>
+      <w:lvlJc w:val="right"/>
+      <w:pPr>
+        <w:ind w:left="4320" w:hanging="360"/>
+      </w:pPr>
+      <w:rPr>
+        <w:u w:val="none"/>
+      </w:rPr>
+    </w:lvl>
+    <w:lvl w:ilvl="6">
+      <w:start w:val="1"/>
+      <w:numFmt w:val="decimal"/>
+      <w:lvlText w:val="%7."/>
+      <w:lvlJc w:val="left"/>
+      <w:pPr>
+        <w:ind w:left="5040" w:hanging="360"/>
+      </w:pPr>
+      <w:rPr>
+        <w:u w:val="none"/>
+      </w:rPr>
+    </w:lvl>
+    <w:lvl w:ilvl="7">
+      <w:start w:val="1"/>
+      <w:numFmt w:val="lowerLetter"/>
+      <w:lvlText w:val="%8."/>
+      <w:lvlJc w:val="left"/>
+      <w:pPr>
+        <w:ind w:left="5760" w:hanging="360"/>
+      </w:pPr>
+      <w:rPr>
+        <w:u w:val="none"/>
+      </w:rPr>
+    </w:lvl>
+    <w:lvl w:ilvl="8">
+      <w:start w:val="1"/>
+      <w:numFmt w:val="lowerRoman"/>
+      <w:lvlText w:val="%9."/>
+      <w:lvlJc w:val="right"/>
+      <w:pPr>
+        <w:ind w:left="6480" w:hanging="360"/>
+      </w:pPr>
+      <w:rPr>
+        <w:u w:val="none"/>
+      </w:rPr>
+    </w:lvl>
+  </w:abstractNum>
+  <w:abstractNum w:abstractNumId="9" w15:restartNumberingAfterBreak="0">
+    <w:nsid w:val="58A6258B"/>
+    <w:multiLevelType w:val="multilevel"/>
+    <w:tmpl w:val="0752403A"/>
     <w:lvl w:ilvl="0">
       <w:start w:val="1"/>
       <w:numFmt w:val="bullet"/>
@@ -9039,123 +9843,10 @@
       </w:rPr>
     </w:lvl>
   </w:abstractNum>
-  <w:abstractNum w:abstractNumId="4" w15:restartNumberingAfterBreak="0">
-    <w:nsid w:val="3217469E"/>
+  <w:abstractNum w:abstractNumId="10" w15:restartNumberingAfterBreak="0">
+    <w:nsid w:val="69A82CB3"/>
     <w:multiLevelType w:val="multilevel"/>
-    <w:tmpl w:val="C7F82ACC"/>
-    <w:lvl w:ilvl="0">
-      <w:start w:val="1"/>
-      <w:numFmt w:val="bullet"/>
-      <w:lvlText w:val="●"/>
-      <w:lvlJc w:val="left"/>
-      <w:pPr>
-        <w:ind w:left="720" w:hanging="360"/>
-      </w:pPr>
-      <w:rPr>
-        <w:u w:val="none"/>
-      </w:rPr>
-    </w:lvl>
-    <w:lvl w:ilvl="1">
-      <w:start w:val="1"/>
-      <w:numFmt w:val="bullet"/>
-      <w:lvlText w:val="○"/>
-      <w:lvlJc w:val="left"/>
-      <w:pPr>
-        <w:ind w:left="1440" w:hanging="360"/>
-      </w:pPr>
-      <w:rPr>
-        <w:u w:val="none"/>
-      </w:rPr>
-    </w:lvl>
-    <w:lvl w:ilvl="2">
-      <w:start w:val="1"/>
-      <w:numFmt w:val="bullet"/>
-      <w:lvlText w:val="■"/>
-      <w:lvlJc w:val="left"/>
-      <w:pPr>
-        <w:ind w:left="2160" w:hanging="360"/>
-      </w:pPr>
-      <w:rPr>
-        <w:u w:val="none"/>
-      </w:rPr>
-    </w:lvl>
-    <w:lvl w:ilvl="3">
-      <w:start w:val="1"/>
-      <w:numFmt w:val="bullet"/>
-      <w:lvlText w:val="●"/>
-      <w:lvlJc w:val="left"/>
-      <w:pPr>
-        <w:ind w:left="2880" w:hanging="360"/>
-      </w:pPr>
-      <w:rPr>
-        <w:u w:val="none"/>
-      </w:rPr>
-    </w:lvl>
-    <w:lvl w:ilvl="4">
-      <w:start w:val="1"/>
-      <w:numFmt w:val="bullet"/>
-      <w:lvlText w:val="○"/>
-      <w:lvlJc w:val="left"/>
-      <w:pPr>
-        <w:ind w:left="3600" w:hanging="360"/>
-      </w:pPr>
-      <w:rPr>
-        <w:u w:val="none"/>
-      </w:rPr>
-    </w:lvl>
-    <w:lvl w:ilvl="5">
-      <w:start w:val="1"/>
-      <w:numFmt w:val="bullet"/>
-      <w:lvlText w:val="■"/>
-      <w:lvlJc w:val="left"/>
-      <w:pPr>
-        <w:ind w:left="4320" w:hanging="360"/>
-      </w:pPr>
-      <w:rPr>
-        <w:u w:val="none"/>
-      </w:rPr>
-    </w:lvl>
-    <w:lvl w:ilvl="6">
-      <w:start w:val="1"/>
-      <w:numFmt w:val="bullet"/>
-      <w:lvlText w:val="●"/>
-      <w:lvlJc w:val="left"/>
-      <w:pPr>
-        <w:ind w:left="5040" w:hanging="360"/>
-      </w:pPr>
-      <w:rPr>
-        <w:u w:val="none"/>
-      </w:rPr>
-    </w:lvl>
-    <w:lvl w:ilvl="7">
-      <w:start w:val="1"/>
-      <w:numFmt w:val="bullet"/>
-      <w:lvlText w:val="○"/>
-      <w:lvlJc w:val="left"/>
-      <w:pPr>
-        <w:ind w:left="5760" w:hanging="360"/>
-      </w:pPr>
-      <w:rPr>
-        <w:u w:val="none"/>
-      </w:rPr>
-    </w:lvl>
-    <w:lvl w:ilvl="8">
-      <w:start w:val="1"/>
-      <w:numFmt w:val="bullet"/>
-      <w:lvlText w:val="■"/>
-      <w:lvlJc w:val="left"/>
-      <w:pPr>
-        <w:ind w:left="6480" w:hanging="360"/>
-      </w:pPr>
-      <w:rPr>
-        <w:u w:val="none"/>
-      </w:rPr>
-    </w:lvl>
-  </w:abstractNum>
-  <w:abstractNum w:abstractNumId="5" w15:restartNumberingAfterBreak="0">
-    <w:nsid w:val="4EBB179E"/>
-    <w:multiLevelType w:val="multilevel"/>
-    <w:tmpl w:val="24BA65A2"/>
+    <w:tmpl w:val="0D3AB4D4"/>
     <w:lvl w:ilvl="0">
       <w:start w:val="1"/>
       <w:numFmt w:val="decimal"/>
@@ -9265,123 +9956,10 @@
       </w:rPr>
     </w:lvl>
   </w:abstractNum>
-  <w:abstractNum w:abstractNumId="6" w15:restartNumberingAfterBreak="0">
-    <w:nsid w:val="516306D7"/>
+  <w:abstractNum w:abstractNumId="11" w15:restartNumberingAfterBreak="0">
+    <w:nsid w:val="74652936"/>
     <w:multiLevelType w:val="multilevel"/>
-    <w:tmpl w:val="40686902"/>
-    <w:lvl w:ilvl="0">
-      <w:start w:val="1"/>
-      <w:numFmt w:val="decimal"/>
-      <w:lvlText w:val="%1."/>
-      <w:lvlJc w:val="left"/>
-      <w:pPr>
-        <w:ind w:left="720" w:hanging="360"/>
-      </w:pPr>
-      <w:rPr>
-        <w:u w:val="none"/>
-      </w:rPr>
-    </w:lvl>
-    <w:lvl w:ilvl="1">
-      <w:start w:val="1"/>
-      <w:numFmt w:val="lowerLetter"/>
-      <w:lvlText w:val="%2."/>
-      <w:lvlJc w:val="left"/>
-      <w:pPr>
-        <w:ind w:left="1440" w:hanging="360"/>
-      </w:pPr>
-      <w:rPr>
-        <w:u w:val="none"/>
-      </w:rPr>
-    </w:lvl>
-    <w:lvl w:ilvl="2">
-      <w:start w:val="1"/>
-      <w:numFmt w:val="lowerRoman"/>
-      <w:lvlText w:val="%3."/>
-      <w:lvlJc w:val="right"/>
-      <w:pPr>
-        <w:ind w:left="2160" w:hanging="360"/>
-      </w:pPr>
-      <w:rPr>
-        <w:u w:val="none"/>
-      </w:rPr>
-    </w:lvl>
-    <w:lvl w:ilvl="3">
-      <w:start w:val="1"/>
-      <w:numFmt w:val="decimal"/>
-      <w:lvlText w:val="%4."/>
-      <w:lvlJc w:val="left"/>
-      <w:pPr>
-        <w:ind w:left="2880" w:hanging="360"/>
-      </w:pPr>
-      <w:rPr>
-        <w:u w:val="none"/>
-      </w:rPr>
-    </w:lvl>
-    <w:lvl w:ilvl="4">
-      <w:start w:val="1"/>
-      <w:numFmt w:val="lowerLetter"/>
-      <w:lvlText w:val="%5."/>
-      <w:lvlJc w:val="left"/>
-      <w:pPr>
-        <w:ind w:left="3600" w:hanging="360"/>
-      </w:pPr>
-      <w:rPr>
-        <w:u w:val="none"/>
-      </w:rPr>
-    </w:lvl>
-    <w:lvl w:ilvl="5">
-      <w:start w:val="1"/>
-      <w:numFmt w:val="lowerRoman"/>
-      <w:lvlText w:val="%6."/>
-      <w:lvlJc w:val="right"/>
-      <w:pPr>
-        <w:ind w:left="4320" w:hanging="360"/>
-      </w:pPr>
-      <w:rPr>
-        <w:u w:val="none"/>
-      </w:rPr>
-    </w:lvl>
-    <w:lvl w:ilvl="6">
-      <w:start w:val="1"/>
-      <w:numFmt w:val="decimal"/>
-      <w:lvlText w:val="%7."/>
-      <w:lvlJc w:val="left"/>
-      <w:pPr>
-        <w:ind w:left="5040" w:hanging="360"/>
-      </w:pPr>
-      <w:rPr>
-        <w:u w:val="none"/>
-      </w:rPr>
-    </w:lvl>
-    <w:lvl w:ilvl="7">
-      <w:start w:val="1"/>
-      <w:numFmt w:val="lowerLetter"/>
-      <w:lvlText w:val="%8."/>
-      <w:lvlJc w:val="left"/>
-      <w:pPr>
-        <w:ind w:left="5760" w:hanging="360"/>
-      </w:pPr>
-      <w:rPr>
-        <w:u w:val="none"/>
-      </w:rPr>
-    </w:lvl>
-    <w:lvl w:ilvl="8">
-      <w:start w:val="1"/>
-      <w:numFmt w:val="lowerRoman"/>
-      <w:lvlText w:val="%9."/>
-      <w:lvlJc w:val="right"/>
-      <w:pPr>
-        <w:ind w:left="6480" w:hanging="360"/>
-      </w:pPr>
-      <w:rPr>
-        <w:u w:val="none"/>
-      </w:rPr>
-    </w:lvl>
-  </w:abstractNum>
-  <w:abstractNum w:abstractNumId="7" w15:restartNumberingAfterBreak="0">
-    <w:nsid w:val="56472537"/>
-    <w:multiLevelType w:val="multilevel"/>
-    <w:tmpl w:val="C336A292"/>
+    <w:tmpl w:val="6C74FEAE"/>
     <w:lvl w:ilvl="0">
       <w:start w:val="1"/>
       <w:numFmt w:val="bullet"/>
@@ -9491,493 +10069,41 @@
       </w:rPr>
     </w:lvl>
   </w:abstractNum>
-  <w:abstractNum w:abstractNumId="8" w15:restartNumberingAfterBreak="0">
-    <w:nsid w:val="5B8B23FF"/>
-    <w:multiLevelType w:val="multilevel"/>
-    <w:tmpl w:val="28AE256E"/>
-    <w:lvl w:ilvl="0">
-      <w:start w:val="1"/>
-      <w:numFmt w:val="decimal"/>
-      <w:lvlText w:val="%1."/>
-      <w:lvlJc w:val="left"/>
-      <w:pPr>
-        <w:ind w:left="720" w:hanging="360"/>
-      </w:pPr>
-      <w:rPr>
-        <w:u w:val="none"/>
-      </w:rPr>
-    </w:lvl>
-    <w:lvl w:ilvl="1">
-      <w:start w:val="1"/>
-      <w:numFmt w:val="lowerLetter"/>
-      <w:lvlText w:val="%2."/>
-      <w:lvlJc w:val="left"/>
-      <w:pPr>
-        <w:ind w:left="1440" w:hanging="360"/>
-      </w:pPr>
-      <w:rPr>
-        <w:u w:val="none"/>
-      </w:rPr>
-    </w:lvl>
-    <w:lvl w:ilvl="2">
-      <w:start w:val="1"/>
-      <w:numFmt w:val="lowerRoman"/>
-      <w:lvlText w:val="%3."/>
-      <w:lvlJc w:val="right"/>
-      <w:pPr>
-        <w:ind w:left="2160" w:hanging="360"/>
-      </w:pPr>
-      <w:rPr>
-        <w:u w:val="none"/>
-      </w:rPr>
-    </w:lvl>
-    <w:lvl w:ilvl="3">
-      <w:start w:val="1"/>
-      <w:numFmt w:val="decimal"/>
-      <w:lvlText w:val="%4."/>
-      <w:lvlJc w:val="left"/>
-      <w:pPr>
-        <w:ind w:left="2880" w:hanging="360"/>
-      </w:pPr>
-      <w:rPr>
-        <w:u w:val="none"/>
-      </w:rPr>
-    </w:lvl>
-    <w:lvl w:ilvl="4">
-      <w:start w:val="1"/>
-      <w:numFmt w:val="lowerLetter"/>
-      <w:lvlText w:val="%5."/>
-      <w:lvlJc w:val="left"/>
-      <w:pPr>
-        <w:ind w:left="3600" w:hanging="360"/>
-      </w:pPr>
-      <w:rPr>
-        <w:u w:val="none"/>
-      </w:rPr>
-    </w:lvl>
-    <w:lvl w:ilvl="5">
-      <w:start w:val="1"/>
-      <w:numFmt w:val="lowerRoman"/>
-      <w:lvlText w:val="%6."/>
-      <w:lvlJc w:val="right"/>
-      <w:pPr>
-        <w:ind w:left="4320" w:hanging="360"/>
-      </w:pPr>
-      <w:rPr>
-        <w:u w:val="none"/>
-      </w:rPr>
-    </w:lvl>
-    <w:lvl w:ilvl="6">
-      <w:start w:val="1"/>
-      <w:numFmt w:val="decimal"/>
-      <w:lvlText w:val="%7."/>
-      <w:lvlJc w:val="left"/>
-      <w:pPr>
-        <w:ind w:left="5040" w:hanging="360"/>
-      </w:pPr>
-      <w:rPr>
-        <w:u w:val="none"/>
-      </w:rPr>
-    </w:lvl>
-    <w:lvl w:ilvl="7">
-      <w:start w:val="1"/>
-      <w:numFmt w:val="lowerLetter"/>
-      <w:lvlText w:val="%8."/>
-      <w:lvlJc w:val="left"/>
-      <w:pPr>
-        <w:ind w:left="5760" w:hanging="360"/>
-      </w:pPr>
-      <w:rPr>
-        <w:u w:val="none"/>
-      </w:rPr>
-    </w:lvl>
-    <w:lvl w:ilvl="8">
-      <w:start w:val="1"/>
-      <w:numFmt w:val="lowerRoman"/>
-      <w:lvlText w:val="%9."/>
-      <w:lvlJc w:val="right"/>
-      <w:pPr>
-        <w:ind w:left="6480" w:hanging="360"/>
-      </w:pPr>
-      <w:rPr>
-        <w:u w:val="none"/>
-      </w:rPr>
-    </w:lvl>
-  </w:abstractNum>
-  <w:abstractNum w:abstractNumId="9" w15:restartNumberingAfterBreak="0">
-    <w:nsid w:val="5FCE3351"/>
-    <w:multiLevelType w:val="multilevel"/>
-    <w:tmpl w:val="F662CDF8"/>
-    <w:lvl w:ilvl="0">
-      <w:start w:val="1"/>
-      <w:numFmt w:val="bullet"/>
-      <w:lvlText w:val="●"/>
-      <w:lvlJc w:val="left"/>
-      <w:pPr>
-        <w:ind w:left="720" w:hanging="360"/>
-      </w:pPr>
-      <w:rPr>
-        <w:u w:val="none"/>
-      </w:rPr>
-    </w:lvl>
-    <w:lvl w:ilvl="1">
-      <w:start w:val="1"/>
-      <w:numFmt w:val="bullet"/>
-      <w:lvlText w:val="○"/>
-      <w:lvlJc w:val="left"/>
-      <w:pPr>
-        <w:ind w:left="1440" w:hanging="360"/>
-      </w:pPr>
-      <w:rPr>
-        <w:u w:val="none"/>
-      </w:rPr>
-    </w:lvl>
-    <w:lvl w:ilvl="2">
-      <w:start w:val="1"/>
-      <w:numFmt w:val="bullet"/>
-      <w:lvlText w:val="■"/>
-      <w:lvlJc w:val="left"/>
-      <w:pPr>
-        <w:ind w:left="2160" w:hanging="360"/>
-      </w:pPr>
-      <w:rPr>
-        <w:u w:val="none"/>
-      </w:rPr>
-    </w:lvl>
-    <w:lvl w:ilvl="3">
-      <w:start w:val="1"/>
-      <w:numFmt w:val="bullet"/>
-      <w:lvlText w:val="●"/>
-      <w:lvlJc w:val="left"/>
-      <w:pPr>
-        <w:ind w:left="2880" w:hanging="360"/>
-      </w:pPr>
-      <w:rPr>
-        <w:u w:val="none"/>
-      </w:rPr>
-    </w:lvl>
-    <w:lvl w:ilvl="4">
-      <w:start w:val="1"/>
-      <w:numFmt w:val="bullet"/>
-      <w:lvlText w:val="○"/>
-      <w:lvlJc w:val="left"/>
-      <w:pPr>
-        <w:ind w:left="3600" w:hanging="360"/>
-      </w:pPr>
-      <w:rPr>
-        <w:u w:val="none"/>
-      </w:rPr>
-    </w:lvl>
-    <w:lvl w:ilvl="5">
-      <w:start w:val="1"/>
-      <w:numFmt w:val="bullet"/>
-      <w:lvlText w:val="■"/>
-      <w:lvlJc w:val="left"/>
-      <w:pPr>
-        <w:ind w:left="4320" w:hanging="360"/>
-      </w:pPr>
-      <w:rPr>
-        <w:u w:val="none"/>
-      </w:rPr>
-    </w:lvl>
-    <w:lvl w:ilvl="6">
-      <w:start w:val="1"/>
-      <w:numFmt w:val="bullet"/>
-      <w:lvlText w:val="●"/>
-      <w:lvlJc w:val="left"/>
-      <w:pPr>
-        <w:ind w:left="5040" w:hanging="360"/>
-      </w:pPr>
-      <w:rPr>
-        <w:u w:val="none"/>
-      </w:rPr>
-    </w:lvl>
-    <w:lvl w:ilvl="7">
-      <w:start w:val="1"/>
-      <w:numFmt w:val="bullet"/>
-      <w:lvlText w:val="○"/>
-      <w:lvlJc w:val="left"/>
-      <w:pPr>
-        <w:ind w:left="5760" w:hanging="360"/>
-      </w:pPr>
-      <w:rPr>
-        <w:u w:val="none"/>
-      </w:rPr>
-    </w:lvl>
-    <w:lvl w:ilvl="8">
-      <w:start w:val="1"/>
-      <w:numFmt w:val="bullet"/>
-      <w:lvlText w:val="■"/>
-      <w:lvlJc w:val="left"/>
-      <w:pPr>
-        <w:ind w:left="6480" w:hanging="360"/>
-      </w:pPr>
-      <w:rPr>
-        <w:u w:val="none"/>
-      </w:rPr>
-    </w:lvl>
-  </w:abstractNum>
-  <w:abstractNum w:abstractNumId="10" w15:restartNumberingAfterBreak="0">
-    <w:nsid w:val="66824837"/>
-    <w:multiLevelType w:val="multilevel"/>
-    <w:tmpl w:val="555643CE"/>
-    <w:lvl w:ilvl="0">
-      <w:start w:val="1"/>
-      <w:numFmt w:val="bullet"/>
-      <w:lvlText w:val="●"/>
-      <w:lvlJc w:val="left"/>
-      <w:pPr>
-        <w:ind w:left="720" w:hanging="360"/>
-      </w:pPr>
-      <w:rPr>
-        <w:u w:val="none"/>
-      </w:rPr>
-    </w:lvl>
-    <w:lvl w:ilvl="1">
-      <w:start w:val="1"/>
-      <w:numFmt w:val="bullet"/>
-      <w:lvlText w:val="●"/>
-      <w:lvlJc w:val="left"/>
-      <w:pPr>
-        <w:ind w:left="1440" w:hanging="360"/>
-      </w:pPr>
-      <w:rPr>
-        <w:u w:val="none"/>
-      </w:rPr>
-    </w:lvl>
-    <w:lvl w:ilvl="2">
-      <w:start w:val="1"/>
-      <w:numFmt w:val="bullet"/>
-      <w:lvlText w:val="●"/>
-      <w:lvlJc w:val="left"/>
-      <w:pPr>
-        <w:ind w:left="2160" w:hanging="360"/>
-      </w:pPr>
-      <w:rPr>
-        <w:u w:val="none"/>
-      </w:rPr>
-    </w:lvl>
-    <w:lvl w:ilvl="3">
-      <w:start w:val="1"/>
-      <w:numFmt w:val="bullet"/>
-      <w:lvlText w:val="●"/>
-      <w:lvlJc w:val="left"/>
-      <w:pPr>
-        <w:ind w:left="2880" w:hanging="360"/>
-      </w:pPr>
-      <w:rPr>
-        <w:u w:val="none"/>
-      </w:rPr>
-    </w:lvl>
-    <w:lvl w:ilvl="4">
-      <w:start w:val="1"/>
-      <w:numFmt w:val="bullet"/>
-      <w:lvlText w:val="●"/>
-      <w:lvlJc w:val="left"/>
-      <w:pPr>
-        <w:ind w:left="3600" w:hanging="360"/>
-      </w:pPr>
-      <w:rPr>
-        <w:u w:val="none"/>
-      </w:rPr>
-    </w:lvl>
-    <w:lvl w:ilvl="5">
-      <w:start w:val="1"/>
-      <w:numFmt w:val="bullet"/>
-      <w:lvlText w:val="●"/>
-      <w:lvlJc w:val="left"/>
-      <w:pPr>
-        <w:ind w:left="4320" w:hanging="360"/>
-      </w:pPr>
-      <w:rPr>
-        <w:u w:val="none"/>
-      </w:rPr>
-    </w:lvl>
-    <w:lvl w:ilvl="6">
-      <w:start w:val="1"/>
-      <w:numFmt w:val="bullet"/>
-      <w:lvlText w:val="●"/>
-      <w:lvlJc w:val="left"/>
-      <w:pPr>
-        <w:ind w:left="5040" w:hanging="360"/>
-      </w:pPr>
-      <w:rPr>
-        <w:u w:val="none"/>
-      </w:rPr>
-    </w:lvl>
-    <w:lvl w:ilvl="7">
-      <w:start w:val="1"/>
-      <w:numFmt w:val="bullet"/>
-      <w:lvlText w:val="●"/>
-      <w:lvlJc w:val="left"/>
-      <w:pPr>
-        <w:ind w:left="5760" w:hanging="360"/>
-      </w:pPr>
-      <w:rPr>
-        <w:u w:val="none"/>
-      </w:rPr>
-    </w:lvl>
-    <w:lvl w:ilvl="8">
-      <w:start w:val="1"/>
-      <w:numFmt w:val="bullet"/>
-      <w:lvlText w:val="●"/>
-      <w:lvlJc w:val="left"/>
-      <w:pPr>
-        <w:ind w:left="6480" w:hanging="360"/>
-      </w:pPr>
-      <w:rPr>
-        <w:u w:val="none"/>
-      </w:rPr>
-    </w:lvl>
-  </w:abstractNum>
-  <w:abstractNum w:abstractNumId="11" w15:restartNumberingAfterBreak="0">
-    <w:nsid w:val="77DE5E35"/>
-    <w:multiLevelType w:val="multilevel"/>
-    <w:tmpl w:val="E0769F2E"/>
-    <w:lvl w:ilvl="0">
-      <w:start w:val="1"/>
-      <w:numFmt w:val="bullet"/>
-      <w:lvlText w:val="-"/>
-      <w:lvlJc w:val="left"/>
-      <w:pPr>
-        <w:ind w:left="720" w:hanging="360"/>
-      </w:pPr>
-      <w:rPr>
-        <w:u w:val="none"/>
-      </w:rPr>
-    </w:lvl>
-    <w:lvl w:ilvl="1">
-      <w:start w:val="1"/>
-      <w:numFmt w:val="bullet"/>
-      <w:lvlText w:val="-"/>
-      <w:lvlJc w:val="left"/>
-      <w:pPr>
-        <w:ind w:left="1440" w:hanging="360"/>
-      </w:pPr>
-      <w:rPr>
-        <w:u w:val="none"/>
-      </w:rPr>
-    </w:lvl>
-    <w:lvl w:ilvl="2">
-      <w:start w:val="1"/>
-      <w:numFmt w:val="bullet"/>
-      <w:lvlText w:val="-"/>
-      <w:lvlJc w:val="left"/>
-      <w:pPr>
-        <w:ind w:left="2160" w:hanging="360"/>
-      </w:pPr>
-      <w:rPr>
-        <w:u w:val="none"/>
-      </w:rPr>
-    </w:lvl>
-    <w:lvl w:ilvl="3">
-      <w:start w:val="1"/>
-      <w:numFmt w:val="bullet"/>
-      <w:lvlText w:val="-"/>
-      <w:lvlJc w:val="left"/>
-      <w:pPr>
-        <w:ind w:left="2880" w:hanging="360"/>
-      </w:pPr>
-      <w:rPr>
-        <w:u w:val="none"/>
-      </w:rPr>
-    </w:lvl>
-    <w:lvl w:ilvl="4">
-      <w:start w:val="1"/>
-      <w:numFmt w:val="bullet"/>
-      <w:lvlText w:val="-"/>
-      <w:lvlJc w:val="left"/>
-      <w:pPr>
-        <w:ind w:left="3600" w:hanging="360"/>
-      </w:pPr>
-      <w:rPr>
-        <w:u w:val="none"/>
-      </w:rPr>
-    </w:lvl>
-    <w:lvl w:ilvl="5">
-      <w:start w:val="1"/>
-      <w:numFmt w:val="bullet"/>
-      <w:lvlText w:val="-"/>
-      <w:lvlJc w:val="left"/>
-      <w:pPr>
-        <w:ind w:left="4320" w:hanging="360"/>
-      </w:pPr>
-      <w:rPr>
-        <w:u w:val="none"/>
-      </w:rPr>
-    </w:lvl>
-    <w:lvl w:ilvl="6">
-      <w:start w:val="1"/>
-      <w:numFmt w:val="bullet"/>
-      <w:lvlText w:val="-"/>
-      <w:lvlJc w:val="left"/>
-      <w:pPr>
-        <w:ind w:left="5040" w:hanging="360"/>
-      </w:pPr>
-      <w:rPr>
-        <w:u w:val="none"/>
-      </w:rPr>
-    </w:lvl>
-    <w:lvl w:ilvl="7">
-      <w:start w:val="1"/>
-      <w:numFmt w:val="bullet"/>
-      <w:lvlText w:val="-"/>
-      <w:lvlJc w:val="left"/>
-      <w:pPr>
-        <w:ind w:left="5760" w:hanging="360"/>
-      </w:pPr>
-      <w:rPr>
-        <w:u w:val="none"/>
-      </w:rPr>
-    </w:lvl>
-    <w:lvl w:ilvl="8">
-      <w:start w:val="1"/>
-      <w:numFmt w:val="bullet"/>
-      <w:lvlText w:val="-"/>
-      <w:lvlJc w:val="left"/>
-      <w:pPr>
-        <w:ind w:left="6480" w:hanging="360"/>
-      </w:pPr>
-      <w:rPr>
-        <w:u w:val="none"/>
-      </w:rPr>
-    </w:lvl>
-  </w:abstractNum>
-  <w:num w:numId="1" w16cid:durableId="1823309338">
+  <w:num w:numId="1" w16cid:durableId="319117203">
+    <w:abstractNumId w:val="8"/>
+  </w:num>
+  <w:num w:numId="2" w16cid:durableId="1240552735">
+    <w:abstractNumId w:val="2"/>
+  </w:num>
+  <w:num w:numId="3" w16cid:durableId="1436514193">
+    <w:abstractNumId w:val="10"/>
+  </w:num>
+  <w:num w:numId="4" w16cid:durableId="2102792959">
+    <w:abstractNumId w:val="0"/>
+  </w:num>
+  <w:num w:numId="5" w16cid:durableId="714085496">
     <w:abstractNumId w:val="5"/>
   </w:num>
-  <w:num w:numId="2" w16cid:durableId="1631012683">
+  <w:num w:numId="6" w16cid:durableId="275143308">
+    <w:abstractNumId w:val="9"/>
+  </w:num>
+  <w:num w:numId="7" w16cid:durableId="668562279">
+    <w:abstractNumId w:val="4"/>
+  </w:num>
+  <w:num w:numId="8" w16cid:durableId="493689161">
+    <w:abstractNumId w:val="3"/>
+  </w:num>
+  <w:num w:numId="9" w16cid:durableId="391197154">
+    <w:abstractNumId w:val="11"/>
+  </w:num>
+  <w:num w:numId="10" w16cid:durableId="2079937143">
+    <w:abstractNumId w:val="7"/>
+  </w:num>
+  <w:num w:numId="11" w16cid:durableId="844631853">
     <w:abstractNumId w:val="1"/>
   </w:num>
-  <w:num w:numId="3" w16cid:durableId="263653472">
-    <w:abstractNumId w:val="8"/>
-  </w:num>
-  <w:num w:numId="4" w16cid:durableId="872380904">
+  <w:num w:numId="12" w16cid:durableId="460003102">
     <w:abstractNumId w:val="6"/>
-  </w:num>
-  <w:num w:numId="5" w16cid:durableId="342822385">
-    <w:abstractNumId w:val="9"/>
-  </w:num>
-  <w:num w:numId="6" w16cid:durableId="1890023803">
-    <w:abstractNumId w:val="3"/>
-  </w:num>
-  <w:num w:numId="7" w16cid:durableId="181285167">
-    <w:abstractNumId w:val="4"/>
-  </w:num>
-  <w:num w:numId="8" w16cid:durableId="1384716972">
-    <w:abstractNumId w:val="10"/>
-  </w:num>
-  <w:num w:numId="9" w16cid:durableId="1878201502">
-    <w:abstractNumId w:val="0"/>
-  </w:num>
-  <w:num w:numId="10" w16cid:durableId="1078602037">
-    <w:abstractNumId w:val="2"/>
-  </w:num>
-  <w:num w:numId="11" w16cid:durableId="424501477">
-    <w:abstractNumId w:val="11"/>
-  </w:num>
-  <w:num w:numId="12" w16cid:durableId="2010060027">
-    <w:abstractNumId w:val="7"/>
   </w:num>
 </w:numbering>
 </file>
@@ -10489,6 +10615,7 @@
   <w:style w:type="character" w:default="1" w:styleId="VarsaylanParagrafYazTipi">
     <w:name w:val="Default Paragraph Font"/>
     <w:uiPriority w:val="1"/>
+    <w:semiHidden/>
     <w:unhideWhenUsed/>
   </w:style>
   <w:style w:type="table" w:default="1" w:styleId="NormalTablo">
@@ -10551,8 +10678,7 @@
       <w:color w:val="CC0000"/>
     </w:rPr>
   </w:style>
-  <w:style w:type="table" w:customStyle="1" w:styleId="52">
-    <w:name w:val="52"/>
+  <w:style w:type="table" w:customStyle="1" w:styleId="a">
     <w:basedOn w:val="TableNormal"/>
     <w:tblPr>
       <w:tblStyleRowBandSize w:val="1"/>
@@ -10565,8 +10691,7 @@
       </w:tblCellMar>
     </w:tblPr>
   </w:style>
-  <w:style w:type="table" w:customStyle="1" w:styleId="51">
-    <w:name w:val="51"/>
+  <w:style w:type="table" w:customStyle="1" w:styleId="a0">
     <w:basedOn w:val="TableNormal"/>
     <w:tblPr>
       <w:tblStyleRowBandSize w:val="1"/>
@@ -10579,8 +10704,7 @@
       </w:tblCellMar>
     </w:tblPr>
   </w:style>
-  <w:style w:type="table" w:customStyle="1" w:styleId="50">
-    <w:name w:val="50"/>
+  <w:style w:type="table" w:customStyle="1" w:styleId="a1">
     <w:basedOn w:val="TableNormal"/>
     <w:tblPr>
       <w:tblStyleRowBandSize w:val="1"/>
@@ -10593,8 +10717,7 @@
       </w:tblCellMar>
     </w:tblPr>
   </w:style>
-  <w:style w:type="table" w:customStyle="1" w:styleId="49">
-    <w:name w:val="49"/>
+  <w:style w:type="table" w:customStyle="1" w:styleId="a2">
     <w:basedOn w:val="TableNormal"/>
     <w:tblPr>
       <w:tblStyleRowBandSize w:val="1"/>
@@ -10607,8 +10730,7 @@
       </w:tblCellMar>
     </w:tblPr>
   </w:style>
-  <w:style w:type="table" w:customStyle="1" w:styleId="48">
-    <w:name w:val="48"/>
+  <w:style w:type="table" w:customStyle="1" w:styleId="a3">
     <w:basedOn w:val="TableNormal"/>
     <w:tblPr>
       <w:tblStyleRowBandSize w:val="1"/>
@@ -10621,8 +10743,7 @@
       </w:tblCellMar>
     </w:tblPr>
   </w:style>
-  <w:style w:type="table" w:customStyle="1" w:styleId="47">
-    <w:name w:val="47"/>
+  <w:style w:type="table" w:customStyle="1" w:styleId="a4">
     <w:basedOn w:val="TableNormal"/>
     <w:tblPr>
       <w:tblStyleRowBandSize w:val="1"/>
@@ -10635,8 +10756,7 @@
       </w:tblCellMar>
     </w:tblPr>
   </w:style>
-  <w:style w:type="table" w:customStyle="1" w:styleId="46">
-    <w:name w:val="46"/>
+  <w:style w:type="table" w:customStyle="1" w:styleId="a5">
     <w:basedOn w:val="TableNormal"/>
     <w:tblPr>
       <w:tblStyleRowBandSize w:val="1"/>
@@ -10649,8 +10769,7 @@
       </w:tblCellMar>
     </w:tblPr>
   </w:style>
-  <w:style w:type="table" w:customStyle="1" w:styleId="45">
-    <w:name w:val="45"/>
+  <w:style w:type="table" w:customStyle="1" w:styleId="a6">
     <w:basedOn w:val="TableNormal"/>
     <w:tblPr>
       <w:tblStyleRowBandSize w:val="1"/>
@@ -10663,8 +10782,7 @@
       </w:tblCellMar>
     </w:tblPr>
   </w:style>
-  <w:style w:type="table" w:customStyle="1" w:styleId="44">
-    <w:name w:val="44"/>
+  <w:style w:type="table" w:customStyle="1" w:styleId="a7">
     <w:basedOn w:val="TableNormal"/>
     <w:tblPr>
       <w:tblStyleRowBandSize w:val="1"/>
@@ -10677,8 +10795,7 @@
       </w:tblCellMar>
     </w:tblPr>
   </w:style>
-  <w:style w:type="table" w:customStyle="1" w:styleId="43">
-    <w:name w:val="43"/>
+  <w:style w:type="table" w:customStyle="1" w:styleId="a8">
     <w:basedOn w:val="TableNormal"/>
     <w:tblPr>
       <w:tblStyleRowBandSize w:val="1"/>
@@ -10691,8 +10808,7 @@
       </w:tblCellMar>
     </w:tblPr>
   </w:style>
-  <w:style w:type="table" w:customStyle="1" w:styleId="42">
-    <w:name w:val="42"/>
+  <w:style w:type="table" w:customStyle="1" w:styleId="a9">
     <w:basedOn w:val="TableNormal"/>
     <w:tblPr>
       <w:tblStyleRowBandSize w:val="1"/>
@@ -10705,8 +10821,7 @@
       </w:tblCellMar>
     </w:tblPr>
   </w:style>
-  <w:style w:type="table" w:customStyle="1" w:styleId="41">
-    <w:name w:val="41"/>
+  <w:style w:type="table" w:customStyle="1" w:styleId="aa">
     <w:basedOn w:val="TableNormal"/>
     <w:tblPr>
       <w:tblStyleRowBandSize w:val="1"/>
@@ -10719,8 +10834,7 @@
       </w:tblCellMar>
     </w:tblPr>
   </w:style>
-  <w:style w:type="table" w:customStyle="1" w:styleId="40">
-    <w:name w:val="40"/>
+  <w:style w:type="table" w:customStyle="1" w:styleId="ab">
     <w:basedOn w:val="TableNormal"/>
     <w:tblPr>
       <w:tblStyleRowBandSize w:val="1"/>
@@ -10733,8 +10847,7 @@
       </w:tblCellMar>
     </w:tblPr>
   </w:style>
-  <w:style w:type="table" w:customStyle="1" w:styleId="39">
-    <w:name w:val="39"/>
+  <w:style w:type="table" w:customStyle="1" w:styleId="ac">
     <w:basedOn w:val="TableNormal"/>
     <w:tblPr>
       <w:tblStyleRowBandSize w:val="1"/>
@@ -10747,8 +10860,7 @@
       </w:tblCellMar>
     </w:tblPr>
   </w:style>
-  <w:style w:type="table" w:customStyle="1" w:styleId="38">
-    <w:name w:val="38"/>
+  <w:style w:type="table" w:customStyle="1" w:styleId="ad">
     <w:basedOn w:val="TableNormal"/>
     <w:tblPr>
       <w:tblStyleRowBandSize w:val="1"/>
@@ -10761,8 +10873,7 @@
       </w:tblCellMar>
     </w:tblPr>
   </w:style>
-  <w:style w:type="table" w:customStyle="1" w:styleId="37">
-    <w:name w:val="37"/>
+  <w:style w:type="table" w:customStyle="1" w:styleId="ae">
     <w:basedOn w:val="TableNormal"/>
     <w:tblPr>
       <w:tblStyleRowBandSize w:val="1"/>
@@ -10775,8 +10886,7 @@
       </w:tblCellMar>
     </w:tblPr>
   </w:style>
-  <w:style w:type="table" w:customStyle="1" w:styleId="36">
-    <w:name w:val="36"/>
+  <w:style w:type="table" w:customStyle="1" w:styleId="af">
     <w:basedOn w:val="TableNormal"/>
     <w:tblPr>
       <w:tblStyleRowBandSize w:val="1"/>
@@ -10789,8 +10899,7 @@
       </w:tblCellMar>
     </w:tblPr>
   </w:style>
-  <w:style w:type="table" w:customStyle="1" w:styleId="35">
-    <w:name w:val="35"/>
+  <w:style w:type="table" w:customStyle="1" w:styleId="af0">
     <w:basedOn w:val="TableNormal"/>
     <w:tblPr>
       <w:tblStyleRowBandSize w:val="1"/>
@@ -10803,8 +10912,7 @@
       </w:tblCellMar>
     </w:tblPr>
   </w:style>
-  <w:style w:type="table" w:customStyle="1" w:styleId="34">
-    <w:name w:val="34"/>
+  <w:style w:type="table" w:customStyle="1" w:styleId="af1">
     <w:basedOn w:val="TableNormal"/>
     <w:tblPr>
       <w:tblStyleRowBandSize w:val="1"/>
@@ -10817,8 +10925,7 @@
       </w:tblCellMar>
     </w:tblPr>
   </w:style>
-  <w:style w:type="table" w:customStyle="1" w:styleId="33">
-    <w:name w:val="33"/>
+  <w:style w:type="table" w:customStyle="1" w:styleId="af2">
     <w:basedOn w:val="TableNormal"/>
     <w:tblPr>
       <w:tblStyleRowBandSize w:val="1"/>
@@ -10831,8 +10938,7 @@
       </w:tblCellMar>
     </w:tblPr>
   </w:style>
-  <w:style w:type="table" w:customStyle="1" w:styleId="32">
-    <w:name w:val="32"/>
+  <w:style w:type="table" w:customStyle="1" w:styleId="af3">
     <w:basedOn w:val="TableNormal"/>
     <w:tblPr>
       <w:tblStyleRowBandSize w:val="1"/>
@@ -10845,8 +10951,7 @@
       </w:tblCellMar>
     </w:tblPr>
   </w:style>
-  <w:style w:type="table" w:customStyle="1" w:styleId="31">
-    <w:name w:val="31"/>
+  <w:style w:type="table" w:customStyle="1" w:styleId="af4">
     <w:basedOn w:val="TableNormal"/>
     <w:tblPr>
       <w:tblStyleRowBandSize w:val="1"/>
@@ -10859,8 +10964,7 @@
       </w:tblCellMar>
     </w:tblPr>
   </w:style>
-  <w:style w:type="table" w:customStyle="1" w:styleId="30">
-    <w:name w:val="30"/>
+  <w:style w:type="table" w:customStyle="1" w:styleId="af5">
     <w:basedOn w:val="TableNormal"/>
     <w:tblPr>
       <w:tblStyleRowBandSize w:val="1"/>
@@ -10873,8 +10977,7 @@
       </w:tblCellMar>
     </w:tblPr>
   </w:style>
-  <w:style w:type="table" w:customStyle="1" w:styleId="29">
-    <w:name w:val="29"/>
+  <w:style w:type="table" w:customStyle="1" w:styleId="af6">
     <w:basedOn w:val="TableNormal"/>
     <w:tblPr>
       <w:tblStyleRowBandSize w:val="1"/>
@@ -10887,8 +10990,7 @@
       </w:tblCellMar>
     </w:tblPr>
   </w:style>
-  <w:style w:type="table" w:customStyle="1" w:styleId="28">
-    <w:name w:val="28"/>
+  <w:style w:type="table" w:customStyle="1" w:styleId="af7">
     <w:basedOn w:val="TableNormal"/>
     <w:tblPr>
       <w:tblStyleRowBandSize w:val="1"/>
@@ -10901,8 +11003,7 @@
       </w:tblCellMar>
     </w:tblPr>
   </w:style>
-  <w:style w:type="table" w:customStyle="1" w:styleId="27">
-    <w:name w:val="27"/>
+  <w:style w:type="table" w:customStyle="1" w:styleId="af8">
     <w:basedOn w:val="TableNormal"/>
     <w:tblPr>
       <w:tblStyleRowBandSize w:val="1"/>
@@ -10915,8 +11016,7 @@
       </w:tblCellMar>
     </w:tblPr>
   </w:style>
-  <w:style w:type="table" w:customStyle="1" w:styleId="26">
-    <w:name w:val="26"/>
+  <w:style w:type="table" w:customStyle="1" w:styleId="af9">
     <w:basedOn w:val="TableNormal"/>
     <w:tblPr>
       <w:tblStyleRowBandSize w:val="1"/>
@@ -10929,8 +11029,7 @@
       </w:tblCellMar>
     </w:tblPr>
   </w:style>
-  <w:style w:type="table" w:customStyle="1" w:styleId="25">
-    <w:name w:val="25"/>
+  <w:style w:type="table" w:customStyle="1" w:styleId="afa">
     <w:basedOn w:val="TableNormal"/>
     <w:tblPr>
       <w:tblStyleRowBandSize w:val="1"/>
@@ -10943,8 +11042,7 @@
       </w:tblCellMar>
     </w:tblPr>
   </w:style>
-  <w:style w:type="table" w:customStyle="1" w:styleId="24">
-    <w:name w:val="24"/>
+  <w:style w:type="table" w:customStyle="1" w:styleId="afb">
     <w:basedOn w:val="TableNormal"/>
     <w:tblPr>
       <w:tblStyleRowBandSize w:val="1"/>
@@ -10957,8 +11055,7 @@
       </w:tblCellMar>
     </w:tblPr>
   </w:style>
-  <w:style w:type="table" w:customStyle="1" w:styleId="23">
-    <w:name w:val="23"/>
+  <w:style w:type="table" w:customStyle="1" w:styleId="afc">
     <w:basedOn w:val="TableNormal"/>
     <w:tblPr>
       <w:tblStyleRowBandSize w:val="1"/>
@@ -10971,8 +11068,7 @@
       </w:tblCellMar>
     </w:tblPr>
   </w:style>
-  <w:style w:type="table" w:customStyle="1" w:styleId="22">
-    <w:name w:val="22"/>
+  <w:style w:type="table" w:customStyle="1" w:styleId="afd">
     <w:basedOn w:val="TableNormal"/>
     <w:tblPr>
       <w:tblStyleRowBandSize w:val="1"/>
@@ -10985,8 +11081,7 @@
       </w:tblCellMar>
     </w:tblPr>
   </w:style>
-  <w:style w:type="table" w:customStyle="1" w:styleId="21">
-    <w:name w:val="21"/>
+  <w:style w:type="table" w:customStyle="1" w:styleId="afe">
     <w:basedOn w:val="TableNormal"/>
     <w:tblPr>
       <w:tblStyleRowBandSize w:val="1"/>
@@ -10999,8 +11094,7 @@
       </w:tblCellMar>
     </w:tblPr>
   </w:style>
-  <w:style w:type="table" w:customStyle="1" w:styleId="20">
-    <w:name w:val="20"/>
+  <w:style w:type="table" w:customStyle="1" w:styleId="aff">
     <w:basedOn w:val="TableNormal"/>
     <w:tblPr>
       <w:tblStyleRowBandSize w:val="1"/>
@@ -11013,8 +11107,7 @@
       </w:tblCellMar>
     </w:tblPr>
   </w:style>
-  <w:style w:type="table" w:customStyle="1" w:styleId="19">
-    <w:name w:val="19"/>
+  <w:style w:type="table" w:customStyle="1" w:styleId="aff0">
     <w:basedOn w:val="TableNormal"/>
     <w:tblPr>
       <w:tblStyleRowBandSize w:val="1"/>
@@ -11027,8 +11120,7 @@
       </w:tblCellMar>
     </w:tblPr>
   </w:style>
-  <w:style w:type="table" w:customStyle="1" w:styleId="18">
-    <w:name w:val="18"/>
+  <w:style w:type="table" w:customStyle="1" w:styleId="aff1">
     <w:basedOn w:val="TableNormal"/>
     <w:tblPr>
       <w:tblStyleRowBandSize w:val="1"/>
@@ -11041,8 +11133,7 @@
       </w:tblCellMar>
     </w:tblPr>
   </w:style>
-  <w:style w:type="table" w:customStyle="1" w:styleId="17">
-    <w:name w:val="17"/>
+  <w:style w:type="table" w:customStyle="1" w:styleId="aff2">
     <w:basedOn w:val="TableNormal"/>
     <w:tblPr>
       <w:tblStyleRowBandSize w:val="1"/>
@@ -11055,8 +11146,7 @@
       </w:tblCellMar>
     </w:tblPr>
   </w:style>
-  <w:style w:type="table" w:customStyle="1" w:styleId="16">
-    <w:name w:val="16"/>
+  <w:style w:type="table" w:customStyle="1" w:styleId="aff3">
     <w:basedOn w:val="TableNormal"/>
     <w:tblPr>
       <w:tblStyleRowBandSize w:val="1"/>
@@ -11069,8 +11159,7 @@
       </w:tblCellMar>
     </w:tblPr>
   </w:style>
-  <w:style w:type="table" w:customStyle="1" w:styleId="15">
-    <w:name w:val="15"/>
+  <w:style w:type="table" w:customStyle="1" w:styleId="aff4">
     <w:basedOn w:val="TableNormal"/>
     <w:tblPr>
       <w:tblStyleRowBandSize w:val="1"/>
@@ -11083,8 +11172,7 @@
       </w:tblCellMar>
     </w:tblPr>
   </w:style>
-  <w:style w:type="table" w:customStyle="1" w:styleId="14">
-    <w:name w:val="14"/>
+  <w:style w:type="table" w:customStyle="1" w:styleId="aff5">
     <w:basedOn w:val="TableNormal"/>
     <w:tblPr>
       <w:tblStyleRowBandSize w:val="1"/>
@@ -11097,8 +11185,7 @@
       </w:tblCellMar>
     </w:tblPr>
   </w:style>
-  <w:style w:type="table" w:customStyle="1" w:styleId="13">
-    <w:name w:val="13"/>
+  <w:style w:type="table" w:customStyle="1" w:styleId="aff6">
     <w:basedOn w:val="TableNormal"/>
     <w:tblPr>
       <w:tblStyleRowBandSize w:val="1"/>
@@ -11111,8 +11198,7 @@
       </w:tblCellMar>
     </w:tblPr>
   </w:style>
-  <w:style w:type="table" w:customStyle="1" w:styleId="12">
-    <w:name w:val="12"/>
+  <w:style w:type="table" w:customStyle="1" w:styleId="aff7">
     <w:basedOn w:val="TableNormal"/>
     <w:tblPr>
       <w:tblStyleRowBandSize w:val="1"/>
@@ -11125,8 +11211,7 @@
       </w:tblCellMar>
     </w:tblPr>
   </w:style>
-  <w:style w:type="table" w:customStyle="1" w:styleId="11">
-    <w:name w:val="11"/>
+  <w:style w:type="table" w:customStyle="1" w:styleId="aff8">
     <w:basedOn w:val="TableNormal"/>
     <w:tblPr>
       <w:tblStyleRowBandSize w:val="1"/>
@@ -11139,8 +11224,7 @@
       </w:tblCellMar>
     </w:tblPr>
   </w:style>
-  <w:style w:type="table" w:customStyle="1" w:styleId="10">
-    <w:name w:val="10"/>
+  <w:style w:type="table" w:customStyle="1" w:styleId="aff9">
     <w:basedOn w:val="TableNormal"/>
     <w:tblPr>
       <w:tblStyleRowBandSize w:val="1"/>
@@ -11153,8 +11237,7 @@
       </w:tblCellMar>
     </w:tblPr>
   </w:style>
-  <w:style w:type="table" w:customStyle="1" w:styleId="9">
-    <w:name w:val="9"/>
+  <w:style w:type="table" w:customStyle="1" w:styleId="affa">
     <w:basedOn w:val="TableNormal"/>
     <w:tblPr>
       <w:tblStyleRowBandSize w:val="1"/>
@@ -11167,8 +11250,7 @@
       </w:tblCellMar>
     </w:tblPr>
   </w:style>
-  <w:style w:type="table" w:customStyle="1" w:styleId="8">
-    <w:name w:val="8"/>
+  <w:style w:type="table" w:customStyle="1" w:styleId="affb">
     <w:basedOn w:val="TableNormal"/>
     <w:tblPr>
       <w:tblStyleRowBandSize w:val="1"/>
@@ -11181,8 +11263,7 @@
       </w:tblCellMar>
     </w:tblPr>
   </w:style>
-  <w:style w:type="table" w:customStyle="1" w:styleId="7">
-    <w:name w:val="7"/>
+  <w:style w:type="table" w:customStyle="1" w:styleId="affc">
     <w:basedOn w:val="TableNormal"/>
     <w:tblPr>
       <w:tblStyleRowBandSize w:val="1"/>
@@ -11195,8 +11276,7 @@
       </w:tblCellMar>
     </w:tblPr>
   </w:style>
-  <w:style w:type="table" w:customStyle="1" w:styleId="6">
-    <w:name w:val="6"/>
+  <w:style w:type="table" w:customStyle="1" w:styleId="affd">
     <w:basedOn w:val="TableNormal"/>
     <w:tblPr>
       <w:tblStyleRowBandSize w:val="1"/>
@@ -11209,8 +11289,7 @@
       </w:tblCellMar>
     </w:tblPr>
   </w:style>
-  <w:style w:type="table" w:customStyle="1" w:styleId="5">
-    <w:name w:val="5"/>
+  <w:style w:type="table" w:customStyle="1" w:styleId="affe">
     <w:basedOn w:val="TableNormal"/>
     <w:tblPr>
       <w:tblStyleRowBandSize w:val="1"/>
@@ -11223,8 +11302,7 @@
       </w:tblCellMar>
     </w:tblPr>
   </w:style>
-  <w:style w:type="table" w:customStyle="1" w:styleId="4">
-    <w:name w:val="4"/>
+  <w:style w:type="table" w:customStyle="1" w:styleId="afff">
     <w:basedOn w:val="TableNormal"/>
     <w:tblPr>
       <w:tblStyleRowBandSize w:val="1"/>
@@ -11237,8 +11315,7 @@
       </w:tblCellMar>
     </w:tblPr>
   </w:style>
-  <w:style w:type="table" w:customStyle="1" w:styleId="3">
-    <w:name w:val="3"/>
+  <w:style w:type="table" w:customStyle="1" w:styleId="afff0">
     <w:basedOn w:val="TableNormal"/>
     <w:tblPr>
       <w:tblStyleRowBandSize w:val="1"/>
@@ -11251,8 +11328,7 @@
       </w:tblCellMar>
     </w:tblPr>
   </w:style>
-  <w:style w:type="table" w:customStyle="1" w:styleId="2">
-    <w:name w:val="2"/>
+  <w:style w:type="table" w:customStyle="1" w:styleId="afff1">
     <w:basedOn w:val="TableNormal"/>
     <w:tblPr>
       <w:tblStyleRowBandSize w:val="1"/>
@@ -11265,8 +11341,7 @@
       </w:tblCellMar>
     </w:tblPr>
   </w:style>
-  <w:style w:type="table" w:customStyle="1" w:styleId="1">
-    <w:name w:val="1"/>
+  <w:style w:type="table" w:customStyle="1" w:styleId="afff2">
     <w:basedOn w:val="TableNormal"/>
     <w:tblPr>
       <w:tblStyleRowBandSize w:val="1"/>
@@ -11600,4 +11675,16 @@
   </a:objectDefaults>
   <a:extraClrSchemeLst/>
 </a:theme>
+</file>
+
+<file path=customXml/item1.xml><?xml version="1.0" encoding="utf-8"?>
+<b:Sources xmlns:b="http://schemas.openxmlformats.org/officeDocument/2006/bibliography" xmlns="http://schemas.openxmlformats.org/officeDocument/2006/bibliography" SelectedStyle="\APASixthEditionOfficeOnline.xsl" StyleName="APA" Version="6"/>
+</file>
+
+<file path=customXml/itemProps1.xml><?xml version="1.0" encoding="utf-8"?>
+<ds:datastoreItem xmlns:ds="http://schemas.openxmlformats.org/officeDocument/2006/customXml" ds:itemID="{25CA4ACC-49A4-4FD9-899D-C59FA36C1C72}">
+  <ds:schemaRefs>
+    <ds:schemaRef ds:uri="http://schemas.openxmlformats.org/officeDocument/2006/bibliography"/>
+  </ds:schemaRefs>
+</ds:datastoreItem>
 </file>
</xml_diff>